<commit_message>
[ADD] FIX CFA Sintesis
</commit_message>
<xml_diff>
--- a/fuentes/CF2_22230062_DU.docx
+++ b/fuentes/CF2_22230062_DU.docx
@@ -1,6 +1,6 @@
 
 <file path=word/document.xml><?xml version="1.0" encoding="utf-8"?>
-<w:document xmlns:wpc="http://schemas.microsoft.com/office/word/2010/wordprocessingCanvas" xmlns:mc="http://schemas.openxmlformats.org/markup-compatibility/2006" xmlns:o="urn:schemas-microsoft-com:office:office" xmlns:r="http://schemas.openxmlformats.org/officeDocument/2006/relationships" xmlns:m="http://schemas.openxmlformats.org/officeDocument/2006/math" xmlns:v="urn:schemas-microsoft-com:vml" xmlns:wp14="http://schemas.microsoft.com/office/word/2010/wordprocessingDrawing" xmlns:wp="http://schemas.openxmlformats.org/drawingml/2006/wordprocessingDrawing" xmlns:w10="urn:schemas-microsoft-com:office:word" xmlns:w="http://schemas.openxmlformats.org/wordprocessingml/2006/main" xmlns:w14="http://schemas.microsoft.com/office/word/2010/wordml" xmlns:w15="http://schemas.microsoft.com/office/word/2012/wordml" xmlns:wpg="http://schemas.microsoft.com/office/word/2010/wordprocessingGroup" xmlns:wpi="http://schemas.microsoft.com/office/word/2010/wordprocessingInk" xmlns:wne="http://schemas.microsoft.com/office/word/2006/wordml" xmlns:wps="http://schemas.microsoft.com/office/word/2010/wordprocessingShape" mc:Ignorable="w14 w15 wp14">
+<w:document xmlns:wpc="http://schemas.microsoft.com/office/word/2010/wordprocessingCanvas" xmlns:cx="http://schemas.microsoft.com/office/drawing/2014/chartex" xmlns:cx1="http://schemas.microsoft.com/office/drawing/2015/9/8/chartex" xmlns:cx2="http://schemas.microsoft.com/office/drawing/2015/10/21/chartex" xmlns:cx3="http://schemas.microsoft.com/office/drawing/2016/5/9/chartex" xmlns:cx4="http://schemas.microsoft.com/office/drawing/2016/5/10/chartex" xmlns:cx5="http://schemas.microsoft.com/office/drawing/2016/5/11/chartex" xmlns:cx6="http://schemas.microsoft.com/office/drawing/2016/5/12/chartex" xmlns:cx7="http://schemas.microsoft.com/office/drawing/2016/5/13/chartex" xmlns:cx8="http://schemas.microsoft.com/office/drawing/2016/5/14/chartex" xmlns:mc="http://schemas.openxmlformats.org/markup-compatibility/2006" xmlns:aink="http://schemas.microsoft.com/office/drawing/2016/ink" xmlns:am3d="http://schemas.microsoft.com/office/drawing/2017/model3d" xmlns:o="urn:schemas-microsoft-com:office:office" xmlns:oel="http://schemas.microsoft.com/office/2019/extlst" xmlns:r="http://schemas.openxmlformats.org/officeDocument/2006/relationships" xmlns:m="http://schemas.openxmlformats.org/officeDocument/2006/math" xmlns:v="urn:schemas-microsoft-com:vml" xmlns:wp14="http://schemas.microsoft.com/office/word/2010/wordprocessingDrawing" xmlns:wp="http://schemas.openxmlformats.org/drawingml/2006/wordprocessingDrawing" xmlns:w10="urn:schemas-microsoft-com:office:word" xmlns:w="http://schemas.openxmlformats.org/wordprocessingml/2006/main" xmlns:w14="http://schemas.microsoft.com/office/word/2010/wordml" xmlns:w15="http://schemas.microsoft.com/office/word/2012/wordml" xmlns:w16cex="http://schemas.microsoft.com/office/word/2018/wordml/cex" xmlns:w16cid="http://schemas.microsoft.com/office/word/2016/wordml/cid" xmlns:w16="http://schemas.microsoft.com/office/word/2018/wordml" xmlns:w16du="http://schemas.microsoft.com/office/word/2023/wordml/word16du" xmlns:w16sdtdh="http://schemas.microsoft.com/office/word/2020/wordml/sdtdatahash" xmlns:w16sdtfl="http://schemas.microsoft.com/office/word/2024/wordml/sdtformatlock" xmlns:w16se="http://schemas.microsoft.com/office/word/2015/wordml/symex" xmlns:wpg="http://schemas.microsoft.com/office/word/2010/wordprocessingGroup" xmlns:wpi="http://schemas.microsoft.com/office/word/2010/wordprocessingInk" xmlns:wne="http://schemas.microsoft.com/office/word/2006/wordml" xmlns:wps="http://schemas.microsoft.com/office/word/2010/wordprocessingShape" mc:Ignorable="w14 w15 w16se w16cid w16 w16cex w16sdtdh w16sdtfl w16du wp14">
   <w:body>
     <w:p>
       <w:r>
@@ -23,7 +23,7 @@
             <wp:docPr id="6" name="Imagen 2">
               <a:extLst xmlns:a="http://schemas.openxmlformats.org/drawingml/2006/main">
                 <a:ext uri="{C183D7F6-B498-43B3-948B-1728B52AA6E4}">
-                  <adec:decorative xmlns:arto="http://schemas.microsoft.com/office/word/2006/arto" xmlns:adec="http://schemas.microsoft.com/office/drawing/2017/decorative" xmlns:w16se="http://schemas.microsoft.com/office/word/2015/wordml/symex" xmlns:w16cid="http://schemas.microsoft.com/office/word/2016/wordml/cid" xmlns:w="http://schemas.openxmlformats.org/wordprocessingml/2006/main" xmlns:w10="urn:schemas-microsoft-com:office:word" xmlns:v="urn:schemas-microsoft-com:vml" xmlns:o="urn:schemas-microsoft-com:office:office" xmlns:am3d="http://schemas.microsoft.com/office/drawing/2017/model3d" xmlns:aink="http://schemas.microsoft.com/office/drawing/2016/ink" xmlns:cx8="http://schemas.microsoft.com/office/drawing/2016/5/14/chartex" xmlns:cx7="http://schemas.microsoft.com/office/drawing/2016/5/13/chartex" xmlns:cx6="http://schemas.microsoft.com/office/drawing/2016/5/12/chartex" xmlns:cx5="http://schemas.microsoft.com/office/drawing/2016/5/11/chartex" xmlns:cx4="http://schemas.microsoft.com/office/drawing/2016/5/10/chartex" xmlns:cx3="http://schemas.microsoft.com/office/drawing/2016/5/9/chartex" xmlns:cx2="http://schemas.microsoft.com/office/drawing/2015/10/21/chartex" xmlns:cx1="http://schemas.microsoft.com/office/drawing/2015/9/8/chartex" xmlns:cx="http://schemas.microsoft.com/office/drawing/2014/chartex" xmlns="" val="1"/>
+                  <adec:decorative xmlns:adec="http://schemas.microsoft.com/office/drawing/2017/decorative" val="1"/>
                 </a:ext>
               </a:extLst>
             </wp:docPr>
@@ -151,7 +151,7 @@
                 <wp:docPr id="4" name="Rectángulo 4">
                   <a:extLst xmlns:a="http://schemas.openxmlformats.org/drawingml/2006/main">
                     <a:ext uri="{C183D7F6-B498-43B3-948B-1728B52AA6E4}">
-                      <adec:decorative xmlns:arto="http://schemas.microsoft.com/office/word/2006/arto" xmlns:adec="http://schemas.microsoft.com/office/drawing/2017/decorative" xmlns:w16se="http://schemas.microsoft.com/office/word/2015/wordml/symex" xmlns:w16cid="http://schemas.microsoft.com/office/word/2016/wordml/cid" xmlns:w="http://schemas.openxmlformats.org/wordprocessingml/2006/main" xmlns:w10="urn:schemas-microsoft-com:office:word" xmlns:v="urn:schemas-microsoft-com:vml" xmlns:o="urn:schemas-microsoft-com:office:office" xmlns:am3d="http://schemas.microsoft.com/office/drawing/2017/model3d" xmlns:aink="http://schemas.microsoft.com/office/drawing/2016/ink" xmlns:cx8="http://schemas.microsoft.com/office/drawing/2016/5/14/chartex" xmlns:cx7="http://schemas.microsoft.com/office/drawing/2016/5/13/chartex" xmlns:cx6="http://schemas.microsoft.com/office/drawing/2016/5/12/chartex" xmlns:cx5="http://schemas.microsoft.com/office/drawing/2016/5/11/chartex" xmlns:cx4="http://schemas.microsoft.com/office/drawing/2016/5/10/chartex" xmlns:cx3="http://schemas.microsoft.com/office/drawing/2016/5/9/chartex" xmlns:cx2="http://schemas.microsoft.com/office/drawing/2015/10/21/chartex" xmlns:cx1="http://schemas.microsoft.com/office/drawing/2015/9/8/chartex" xmlns:cx="http://schemas.microsoft.com/office/drawing/2014/chartex" xmlns="" val="1"/>
+                      <adec:decorative xmlns:adec="http://schemas.microsoft.com/office/drawing/2017/decorative" val="1"/>
                     </a:ext>
                   </a:extLst>
                 </wp:docPr>
@@ -240,21 +240,21 @@
         <mc:AlternateContent>
           <mc:Choice Requires="wps">
             <w:drawing>
-              <wp:anchor distT="45720" distB="45720" distL="114300" distR="114300" simplePos="0" relativeHeight="251657728" behindDoc="0" locked="0" layoutInCell="1" allowOverlap="1" wp14:anchorId="5E459EE6" wp14:editId="6DB25ECF">
+              <wp:anchor distT="45720" distB="45720" distL="114300" distR="114300" simplePos="0" relativeHeight="251657728" behindDoc="0" locked="0" layoutInCell="1" allowOverlap="1" wp14:anchorId="5E459EE6" wp14:editId="441BE73D">
                 <wp:simplePos x="0" y="0"/>
                 <wp:positionH relativeFrom="column">
                   <wp:posOffset>-262890</wp:posOffset>
                 </wp:positionH>
                 <wp:positionV relativeFrom="paragraph">
-                  <wp:posOffset>279400</wp:posOffset>
+                  <wp:posOffset>281940</wp:posOffset>
                 </wp:positionV>
-                <wp:extent cx="6209665" cy="1857375"/>
+                <wp:extent cx="6659880" cy="1857375"/>
                 <wp:effectExtent l="0" t="0" r="0" b="9525"/>
                 <wp:wrapNone/>
                 <wp:docPr id="2" name="Cuadro de texto 2">
                   <a:extLst xmlns:a="http://schemas.openxmlformats.org/drawingml/2006/main">
                     <a:ext uri="{C183D7F6-B498-43B3-948B-1728B52AA6E4}">
-                      <adec:decorative xmlns:arto="http://schemas.microsoft.com/office/word/2006/arto" xmlns:adec="http://schemas.microsoft.com/office/drawing/2017/decorative" xmlns:w16se="http://schemas.microsoft.com/office/word/2015/wordml/symex" xmlns:w16cid="http://schemas.microsoft.com/office/word/2016/wordml/cid" xmlns:w="http://schemas.openxmlformats.org/wordprocessingml/2006/main" xmlns:w10="urn:schemas-microsoft-com:office:word" xmlns:v="urn:schemas-microsoft-com:vml" xmlns:o="urn:schemas-microsoft-com:office:office" xmlns:am3d="http://schemas.microsoft.com/office/drawing/2017/model3d" xmlns:aink="http://schemas.microsoft.com/office/drawing/2016/ink" xmlns:cx8="http://schemas.microsoft.com/office/drawing/2016/5/14/chartex" xmlns:cx7="http://schemas.microsoft.com/office/drawing/2016/5/13/chartex" xmlns:cx6="http://schemas.microsoft.com/office/drawing/2016/5/12/chartex" xmlns:cx5="http://schemas.microsoft.com/office/drawing/2016/5/11/chartex" xmlns:cx4="http://schemas.microsoft.com/office/drawing/2016/5/10/chartex" xmlns:cx3="http://schemas.microsoft.com/office/drawing/2016/5/9/chartex" xmlns:cx2="http://schemas.microsoft.com/office/drawing/2015/10/21/chartex" xmlns:cx1="http://schemas.microsoft.com/office/drawing/2015/9/8/chartex" xmlns:cx="http://schemas.microsoft.com/office/drawing/2014/chartex" xmlns="" val="1"/>
+                      <adec:decorative xmlns:adec="http://schemas.microsoft.com/office/drawing/2017/decorative" val="1"/>
                     </a:ext>
                   </a:extLst>
                 </wp:docPr>
@@ -270,7 +270,7 @@
                       <wps:spPr bwMode="auto">
                         <a:xfrm>
                           <a:off x="0" y="0"/>
-                          <a:ext cx="6209665" cy="1857375"/>
+                          <a:ext cx="6659880" cy="1857375"/>
                         </a:xfrm>
                         <a:prstGeom prst="rect">
                           <a:avLst/>
@@ -328,7 +328,7 @@
                 <v:stroke joinstyle="miter"/>
                 <v:path gradientshapeok="t" o:connecttype="rect"/>
               </v:shapetype>
-              <v:shape id="Cuadro de texto 2" o:spid="_x0000_s1026" type="#_x0000_t202" style="position:absolute;left:0;text-align:left;margin-left:-20.7pt;margin-top:22pt;width:488.95pt;height:146.25pt;z-index:251657728;visibility:visible;mso-wrap-style:square;mso-width-percent:0;mso-height-percent:0;mso-wrap-distance-left:9pt;mso-wrap-distance-top:3.6pt;mso-wrap-distance-right:9pt;mso-wrap-distance-bottom:3.6pt;mso-position-horizontal:absolute;mso-position-horizontal-relative:text;mso-position-vertical:absolute;mso-position-vertical-relative:text;mso-width-percent:0;mso-height-percent:0;mso-width-relative:margin;mso-height-relative:margin;v-text-anchor:top" o:gfxdata="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" filled="f" stroked="f">
+              <v:shape id="Cuadro de texto 2" o:spid="_x0000_s1026" type="#_x0000_t202" alt="&quot;&quot;" style="position:absolute;left:0;text-align:left;margin-left:-20.7pt;margin-top:22.2pt;width:524.4pt;height:146.25pt;z-index:251657728;visibility:visible;mso-wrap-style:square;mso-width-percent:0;mso-height-percent:0;mso-wrap-distance-left:9pt;mso-wrap-distance-top:3.6pt;mso-wrap-distance-right:9pt;mso-wrap-distance-bottom:3.6pt;mso-position-horizontal:absolute;mso-position-horizontal-relative:text;mso-position-vertical:absolute;mso-position-vertical-relative:text;mso-width-percent:0;mso-height-percent:0;mso-width-relative:margin;mso-height-relative:margin;v-text-anchor:top" o:gfxdata="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" filled="f" stroked="f">
                 <v:textbox>
                   <w:txbxContent>
                     <w:p>
@@ -498,7 +498,7 @@
     </w:p>
     <w:p>
       <w:pPr>
-        <w:pStyle w:val="TtulodeTDC"/>
+        <w:pStyle w:val="TtuloTDC"/>
         <w:spacing w:line="360" w:lineRule="auto"/>
       </w:pPr>
       <w:r>
@@ -689,10 +689,6 @@
     <w:p>
       <w:pPr>
         <w:pStyle w:val="TDC2"/>
-        <w:tabs>
-          <w:tab w:val="left" w:pos="1760"/>
-          <w:tab w:val="right" w:leader="dot" w:pos="9962"/>
-        </w:tabs>
         <w:rPr>
           <w:rFonts w:asciiTheme="minorHAnsi" w:eastAsiaTheme="minorEastAsia" w:hAnsiTheme="minorHAnsi" w:cstheme="minorBidi"/>
           <w:noProof/>
@@ -779,10 +775,6 @@
     <w:p>
       <w:pPr>
         <w:pStyle w:val="TDC2"/>
-        <w:tabs>
-          <w:tab w:val="left" w:pos="1760"/>
-          <w:tab w:val="right" w:leader="dot" w:pos="9962"/>
-        </w:tabs>
         <w:rPr>
           <w:rFonts w:asciiTheme="minorHAnsi" w:eastAsiaTheme="minorEastAsia" w:hAnsiTheme="minorHAnsi" w:cstheme="minorBidi"/>
           <w:noProof/>
@@ -869,10 +861,6 @@
     <w:p>
       <w:pPr>
         <w:pStyle w:val="TDC2"/>
-        <w:tabs>
-          <w:tab w:val="left" w:pos="1760"/>
-          <w:tab w:val="right" w:leader="dot" w:pos="9962"/>
-        </w:tabs>
         <w:rPr>
           <w:rFonts w:asciiTheme="minorHAnsi" w:eastAsiaTheme="minorEastAsia" w:hAnsiTheme="minorHAnsi" w:cstheme="minorBidi"/>
           <w:noProof/>
@@ -959,10 +947,6 @@
     <w:p>
       <w:pPr>
         <w:pStyle w:val="TDC2"/>
-        <w:tabs>
-          <w:tab w:val="left" w:pos="1760"/>
-          <w:tab w:val="right" w:leader="dot" w:pos="9962"/>
-        </w:tabs>
         <w:rPr>
           <w:rFonts w:asciiTheme="minorHAnsi" w:eastAsiaTheme="minorEastAsia" w:hAnsiTheme="minorHAnsi" w:cstheme="minorBidi"/>
           <w:noProof/>
@@ -1049,10 +1033,6 @@
     <w:p>
       <w:pPr>
         <w:pStyle w:val="TDC2"/>
-        <w:tabs>
-          <w:tab w:val="left" w:pos="1760"/>
-          <w:tab w:val="right" w:leader="dot" w:pos="9962"/>
-        </w:tabs>
         <w:rPr>
           <w:rFonts w:asciiTheme="minorHAnsi" w:eastAsiaTheme="minorEastAsia" w:hAnsiTheme="minorHAnsi" w:cstheme="minorBidi"/>
           <w:noProof/>
@@ -1446,6 +1426,7 @@
     </w:p>
     <w:p>
       <w:pPr>
+        <w:spacing w:before="0" w:after="0"/>
         <w:rPr>
           <w:lang w:eastAsia="es-CO"/>
         </w:rPr>
@@ -1460,23 +1441,26 @@
     <w:p>
       <w:pPr>
         <w:pStyle w:val="Video"/>
-        <w:jc w:val="left"/>
-      </w:pPr>
-      <w:r>
-        <w:t>Análisis de viabilidad, eficiencia y cuantificación de impactos en procesos energéticos– Introducción</w:t>
-      </w:r>
-    </w:p>
-    <w:p>
+        <w:spacing w:before="0" w:after="0"/>
+      </w:pPr>
+      <w:r>
+        <w:t>Análisis de viabilidad, eficiencia y cuantificación de impactos en procesos energéticos–Introducción</w:t>
+      </w:r>
+    </w:p>
+    <w:p>
+      <w:pPr>
+        <w:ind w:firstLine="0"/>
+        <w:jc w:val="center"/>
+      </w:pPr>
       <w:r>
         <w:rPr>
           <w:noProof/>
-          <w:lang w:eastAsia="es-CO"/>
         </w:rPr>
         <w:drawing>
-          <wp:inline distT="0" distB="0" distL="0" distR="0" wp14:anchorId="5D247019" wp14:editId="7F33A129">
-            <wp:extent cx="5574675" cy="2831465"/>
-            <wp:effectExtent l="0" t="0" r="6985" b="6985"/>
-            <wp:docPr id="16" name="Imagen 16"/>
+          <wp:inline distT="0" distB="0" distL="0" distR="0" wp14:anchorId="5DCB5179" wp14:editId="4FD4D111">
+            <wp:extent cx="4583495" cy="2578100"/>
+            <wp:effectExtent l="0" t="0" r="7620" b="0"/>
+            <wp:docPr id="1083652026" name="Imagen 4"/>
             <wp:cNvGraphicFramePr>
               <a:graphicFrameLocks xmlns:a="http://schemas.openxmlformats.org/drawingml/2006/main" noChangeAspect="1"/>
             </wp:cNvGraphicFramePr>
@@ -1484,13 +1468,13 @@
               <a:graphicData uri="http://schemas.openxmlformats.org/drawingml/2006/picture">
                 <pic:pic xmlns:pic="http://schemas.openxmlformats.org/drawingml/2006/picture">
                   <pic:nvPicPr>
-                    <pic:cNvPr id="0" name="Picture 2" descr="https://i3.ytimg.com/vi/8aMSJHO4R_Y/maxresdefault.jpg"/>
+                    <pic:cNvPr id="0" name="Picture 1"/>
                     <pic:cNvPicPr>
                       <a:picLocks noChangeAspect="1" noChangeArrowheads="1"/>
                     </pic:cNvPicPr>
                   </pic:nvPicPr>
                   <pic:blipFill>
-                    <a:blip r:embed="rId12">
+                    <a:blip r:embed="rId12" cstate="print">
                       <a:extLst>
                         <a:ext uri="{28A0092B-C50C-407E-A947-70E740481C1C}">
                           <a14:useLocalDpi xmlns:a14="http://schemas.microsoft.com/office/drawing/2010/main" val="0"/>
@@ -1505,7 +1489,7 @@
                   <pic:spPr bwMode="auto">
                     <a:xfrm>
                       <a:off x="0" y="0"/>
-                      <a:ext cx="5591256" cy="2839887"/>
+                      <a:ext cx="4606595" cy="2591093"/>
                     </a:xfrm>
                     <a:prstGeom prst="rect">
                       <a:avLst/>
@@ -1521,26 +1505,21 @@
           </wp:inline>
         </w:drawing>
       </w:r>
-      <w:r>
-        <w:rPr>
-          <w:noProof/>
-          <w:lang w:eastAsia="es-CO"/>
-        </w:rPr>
-        <w:t xml:space="preserve"> </w:t>
-      </w:r>
     </w:p>
     <w:bookmarkStart w:id="2" w:name="_Hlk161159634"/>
     <w:p>
       <w:pPr>
-        <w:rPr>
-          <w:b/>
-        </w:rPr>
-      </w:pPr>
-      <w:r>
-        <w:rPr>
-          <w:b/>
-        </w:rPr>
-        <w:lastRenderedPageBreak/>
+        <w:spacing w:before="0" w:after="0"/>
+        <w:ind w:firstLine="0"/>
+        <w:jc w:val="center"/>
+        <w:rPr>
+          <w:b/>
+        </w:rPr>
+      </w:pPr>
+      <w:r>
+        <w:rPr>
+          <w:b/>
+        </w:rPr>
         <w:fldChar w:fldCharType="begin"/>
       </w:r>
       <w:r>
@@ -1548,6 +1527,11 @@
           <w:b/>
         </w:rPr>
         <w:instrText xml:space="preserve"> HYPERLINK "https://www.youtube.com/watch?v=8aMSJHO4R_Y" </w:instrText>
+      </w:r>
+      <w:r>
+        <w:rPr>
+          <w:b/>
+        </w:rPr>
       </w:r>
       <w:r>
         <w:rPr>
@@ -1585,7 +1569,8 @@
           </w:tcPr>
           <w:p>
             <w:pPr>
-              <w:jc w:val="center"/>
+              <w:spacing w:before="0" w:after="0"/>
+              <w:ind w:firstLine="0"/>
               <w:rPr>
                 <w:b/>
               </w:rPr>
@@ -1594,10 +1579,23 @@
               <w:rPr>
                 <w:b/>
               </w:rPr>
-              <w:t xml:space="preserve">Síntesis del video: </w:t>
+              <w:lastRenderedPageBreak/>
+              <w:t xml:space="preserve">Transcripción </w:t>
             </w:r>
             <w:r>
-              <w:t>Análisis de viabilidad, eficiencia y cuantificación de im</w:t>
+              <w:rPr>
+                <w:b/>
+              </w:rPr>
+              <w:t xml:space="preserve">del video: </w:t>
+            </w:r>
+            <w:r>
+              <w:rPr>
+                <w:bCs/>
+              </w:rPr>
+              <w:t>a</w:t>
+            </w:r>
+            <w:r>
+              <w:t>nálisis de viabilidad, eficiencia y cuantificación de im</w:t>
             </w:r>
             <w:r>
               <w:t>pactos en procesos energéticos–</w:t>
@@ -1614,36 +1612,63 @@
             <w:tcW w:w="9962" w:type="dxa"/>
           </w:tcPr>
           <w:p>
+            <w:pPr>
+              <w:spacing w:before="0" w:after="0"/>
+            </w:pPr>
             <w:r>
-              <w:t>Este componente formativo brinda las bases para evaluar soluciones energéticas  desde una perspectiva técnica, económica y ambiental, permitiendo una visión integral de cada alternativa.</w:t>
+              <w:t xml:space="preserve">Este componente formativo brinda las bases para evaluar soluciones </w:t>
+            </w:r>
+            <w:r>
+              <w:t>energéticas desde</w:t>
+            </w:r>
+            <w:r>
+              <w:t xml:space="preserve"> una perspectiva técnica, económica y ambiental, permitiendo una visión integral de cada alternativa.</w:t>
             </w:r>
           </w:p>
           <w:p>
+            <w:pPr>
+              <w:spacing w:before="0" w:after="0"/>
+            </w:pPr>
             <w:r>
               <w:t>A lo largo del contenido, el aprendiz desarrollará habilidades para identificar y cuantificar los impactos ambientales asociados a los recursos utilizados, así como a evaluar la eficiencia de diferentes tecnologías y determinar su viabilidad financiera.</w:t>
             </w:r>
           </w:p>
           <w:p>
+            <w:pPr>
+              <w:spacing w:before="0" w:after="0"/>
+            </w:pPr>
             <w:r>
               <w:t>También se presentan los principios fundamentales de las energías renovables, entendiendo cómo su potencial varía según las características del territorio.</w:t>
             </w:r>
           </w:p>
           <w:p>
+            <w:pPr>
+              <w:spacing w:before="0" w:after="0"/>
+            </w:pPr>
             <w:r>
               <w:t>Además, se introduce la estimación de la reducción de emisiones de Gases de Efecto Invernadero - GEI como un criterio esencial para seleccionar alternativas verdaderamente sostenibles.</w:t>
             </w:r>
           </w:p>
           <w:p>
+            <w:pPr>
+              <w:spacing w:before="0" w:after="0"/>
+            </w:pPr>
             <w:r>
               <w:t>Con estos conocimientos, el aprendiz estará en capacidad de elaborar un diagnóstico sólido y fundamentado, que servirá como base para la construcción del Plan de Gestión Sostenible Energética (PGSE).</w:t>
             </w:r>
           </w:p>
           <w:p>
+            <w:pPr>
+              <w:spacing w:before="0" w:after="0"/>
+            </w:pPr>
             <w:r>
               <w:t>Porque comprender estos aspectos no es solo una tarea técnica…</w:t>
             </w:r>
           </w:p>
           <w:p>
+            <w:pPr>
+              <w:spacing w:before="0" w:after="0"/>
+            </w:pPr>
             <w:r>
               <w:t>Es la base para tomar decisiones energéticas responsables y sostenibles para el futuro.</w:t>
             </w:r>
@@ -1659,6 +1684,15 @@
     </w:p>
     <w:p>
       <w:pPr>
+        <w:spacing w:before="0" w:after="0" w:line="240" w:lineRule="auto"/>
+        <w:ind w:firstLine="0"/>
+      </w:pPr>
+      <w:r>
+        <w:br w:type="page"/>
+      </w:r>
+    </w:p>
+    <w:p>
+      <w:pPr>
         <w:pStyle w:val="Ttulo1"/>
         <w:spacing w:line="360" w:lineRule="auto"/>
         <w:rPr>
@@ -1695,21 +1729,7 @@
         <w:rPr>
           <w:lang w:eastAsia="es-CO"/>
         </w:rPr>
-        <w:t xml:space="preserve">El estudio de los fundamentos y el diagnóstico de la eficiencia energética </w:t>
-      </w:r>
-      <w:proofErr w:type="gramStart"/>
-      <w:r>
-        <w:rPr>
-          <w:lang w:eastAsia="es-CO"/>
-        </w:rPr>
-        <w:t>permite</w:t>
-      </w:r>
-      <w:proofErr w:type="gramEnd"/>
-      <w:r>
-        <w:rPr>
-          <w:lang w:eastAsia="es-CO"/>
-        </w:rPr>
-        <w:t xml:space="preserve"> comprender cómo se utiliza la energía en los diferentes procesos y qué factores determinan su rendimiento. Este apartado brinda al aprendiz las bases necesarias para analizar el consumo, identificar ineficiencias y reconocer oportunidades de mejora que contribuyan a una gestión energética más responsable y sostenible.</w:t>
+        <w:t>El estudio de los fundamentos y el diagnóstico de la eficiencia energética permite comprender cómo se utiliza la energía en los diferentes procesos y qué factores determinan su rendimiento. Este apartado brinda al aprendiz las bases necesarias para analizar el consumo, identificar ineficiencias y reconocer oportunidades de mejora que contribuyan a una gestión energética más responsable y sostenible.</w:t>
       </w:r>
       <w:r>
         <w:rPr>
@@ -2985,35 +3005,7 @@
         <w:rPr>
           <w:lang w:eastAsia="es-CO"/>
         </w:rPr>
-        <w:t xml:space="preserve">la reducción del consumo energético (expresada en </w:t>
-      </w:r>
-      <w:proofErr w:type="spellStart"/>
-      <w:r>
-        <w:rPr>
-          <w:lang w:eastAsia="es-CO"/>
-        </w:rPr>
-        <w:t>kWh</w:t>
-      </w:r>
-      <w:proofErr w:type="spellEnd"/>
-      <w:r>
-        <w:rPr>
-          <w:lang w:eastAsia="es-CO"/>
-        </w:rPr>
-        <w:t xml:space="preserve"> o </w:t>
-      </w:r>
-      <w:proofErr w:type="spellStart"/>
-      <w:r>
-        <w:rPr>
-          <w:lang w:eastAsia="es-CO"/>
-        </w:rPr>
-        <w:t>MWh</w:t>
-      </w:r>
-      <w:proofErr w:type="spellEnd"/>
-      <w:r>
-        <w:rPr>
-          <w:lang w:eastAsia="es-CO"/>
-        </w:rPr>
-        <w:t>) y la disminución de costos operativos deben traducirse en ahorros monetarios anuales. Estos valores se convierten en el flujo de caja positivo del proyecto.</w:t>
+        <w:t>la reducción del consumo energético (expresada en kWh o MWh) y la disminución de costos operativos deben traducirse en ahorros monetarios anuales. Estos valores se convierten en el flujo de caja positivo del proyecto.</w:t>
       </w:r>
     </w:p>
     <w:p>
@@ -3356,7 +3348,7 @@
     <w:p>
       <w:pPr>
         <w:pStyle w:val="Ttulo2"/>
-        <w:spacing w:line="360" w:lineRule="auto"/>
+        <w:spacing w:before="0" w:after="0" w:line="360" w:lineRule="auto"/>
       </w:pPr>
       <w:bookmarkStart w:id="5" w:name="_Toc223941898"/>
       <w:r>
@@ -3367,6 +3359,7 @@
     </w:p>
     <w:p>
       <w:pPr>
+        <w:spacing w:before="0" w:after="0"/>
         <w:rPr>
           <w:lang w:eastAsia="es-CO"/>
         </w:rPr>
@@ -3380,6 +3373,7 @@
     </w:p>
     <w:p>
       <w:pPr>
+        <w:spacing w:before="0" w:after="0"/>
         <w:rPr>
           <w:lang w:eastAsia="es-CO"/>
         </w:rPr>
@@ -3398,37 +3392,23 @@
           <w:ilvl w:val="0"/>
           <w:numId w:val="14"/>
         </w:numPr>
-        <w:rPr>
-          <w:b/>
-          <w:lang w:eastAsia="es-CO"/>
-        </w:rPr>
-      </w:pPr>
-      <w:r>
-        <w:rPr>
-          <w:b/>
-          <w:lang w:eastAsia="es-CO"/>
-        </w:rPr>
-        <w:t>Metodología para la cuantificación de variables de eficiencia (</w:t>
-      </w:r>
-      <w:proofErr w:type="spellStart"/>
-      <w:r>
-        <w:rPr>
-          <w:b/>
-          <w:lang w:eastAsia="es-CO"/>
-        </w:rPr>
-        <w:t>kWh</w:t>
-      </w:r>
-      <w:proofErr w:type="spellEnd"/>
-      <w:r>
-        <w:rPr>
-          <w:b/>
-          <w:lang w:eastAsia="es-CO"/>
-        </w:rPr>
-        <w:t>, agua, suelo, etc.)</w:t>
-      </w:r>
-    </w:p>
-    <w:p>
-      <w:pPr>
+        <w:spacing w:before="0" w:after="0"/>
+        <w:rPr>
+          <w:b/>
+          <w:lang w:eastAsia="es-CO"/>
+        </w:rPr>
+      </w:pPr>
+      <w:r>
+        <w:rPr>
+          <w:b/>
+          <w:lang w:eastAsia="es-CO"/>
+        </w:rPr>
+        <w:t>Metodología para la cuantificación de variables de eficiencia (kWh, agua, suelo, etc.)</w:t>
+      </w:r>
+    </w:p>
+    <w:p>
+      <w:pPr>
+        <w:spacing w:before="0" w:after="0"/>
         <w:rPr>
           <w:lang w:eastAsia="es-CO"/>
         </w:rPr>
@@ -3447,6 +3427,7 @@
           <w:ilvl w:val="0"/>
           <w:numId w:val="9"/>
         </w:numPr>
+        <w:spacing w:before="0" w:after="0"/>
         <w:rPr>
           <w:b/>
           <w:lang w:eastAsia="es-CO"/>
@@ -3462,43 +3443,16 @@
     </w:p>
     <w:p>
       <w:pPr>
-        <w:rPr>
-          <w:lang w:eastAsia="es-CO"/>
-        </w:rPr>
-      </w:pPr>
-      <w:r>
-        <w:rPr>
-          <w:lang w:eastAsia="es-CO"/>
-        </w:rPr>
-        <w:t>Se enseña a calcular el ahorro total de energía eléctrica (</w:t>
-      </w:r>
-      <w:proofErr w:type="spellStart"/>
-      <w:r>
-        <w:rPr>
-          <w:lang w:eastAsia="es-CO"/>
-        </w:rPr>
-        <w:t>kWh</w:t>
-      </w:r>
-      <w:proofErr w:type="spellEnd"/>
-      <w:r>
-        <w:rPr>
-          <w:lang w:eastAsia="es-CO"/>
-        </w:rPr>
-        <w:t xml:space="preserve"> o </w:t>
-      </w:r>
-      <w:proofErr w:type="spellStart"/>
-      <w:r>
-        <w:rPr>
-          <w:lang w:eastAsia="es-CO"/>
-        </w:rPr>
-        <w:t>MWh</w:t>
-      </w:r>
-      <w:proofErr w:type="spellEnd"/>
-      <w:r>
-        <w:rPr>
-          <w:lang w:eastAsia="es-CO"/>
-        </w:rPr>
-        <w:t>) y térmica generado por la medida implementada.</w:t>
+        <w:spacing w:before="0" w:after="0"/>
+        <w:rPr>
+          <w:lang w:eastAsia="es-CO"/>
+        </w:rPr>
+      </w:pPr>
+      <w:r>
+        <w:rPr>
+          <w:lang w:eastAsia="es-CO"/>
+        </w:rPr>
+        <w:t>Se enseña a calcular el ahorro total de energía eléctrica (kWh o MWh) y térmica generado por la medida implementada.</w:t>
       </w:r>
     </w:p>
     <w:p>
@@ -3574,36 +3528,8 @@
         <w:rPr>
           <w:lang w:eastAsia="es-CO"/>
         </w:rPr>
-        <w:t xml:space="preserve">Un proyecto que ahorra 12.000 </w:t>
-      </w:r>
-      <w:proofErr w:type="spellStart"/>
-      <w:r>
-        <w:rPr>
-          <w:lang w:eastAsia="es-CO"/>
-        </w:rPr>
-        <w:t>kWh</w:t>
-      </w:r>
-      <w:proofErr w:type="spellEnd"/>
-      <w:r>
-        <w:rPr>
-          <w:lang w:eastAsia="es-CO"/>
-        </w:rPr>
-        <w:t xml:space="preserve"> / año evita que se quemen X litros de diésel o Y toneladas de carbón, según la matriz energética local.</w:t>
-      </w:r>
-    </w:p>
-    <w:p>
-      <w:pPr>
-        <w:rPr>
-          <w:lang w:eastAsia="es-CO"/>
-        </w:rPr>
-      </w:pPr>
-    </w:p>
-    <w:p>
-      <w:pPr>
-        <w:rPr>
-          <w:lang w:eastAsia="es-CO"/>
-        </w:rPr>
-      </w:pPr>
+        <w:t>Un proyecto que ahorra 12.000 kWh / año evita que se quemen X litros de diésel o Y toneladas de carbón, según la matriz energética local.</w:t>
+      </w:r>
     </w:p>
     <w:p>
       <w:pPr>
@@ -3612,22 +3538,23 @@
           <w:ilvl w:val="0"/>
           <w:numId w:val="9"/>
         </w:numPr>
-        <w:rPr>
-          <w:b/>
-          <w:lang w:eastAsia="es-CO"/>
-        </w:rPr>
-      </w:pPr>
-      <w:r>
-        <w:rPr>
-          <w:b/>
-          <w:lang w:eastAsia="es-CO"/>
-        </w:rPr>
-        <w:lastRenderedPageBreak/>
+        <w:spacing w:before="0" w:after="0"/>
+        <w:rPr>
+          <w:b/>
+          <w:lang w:eastAsia="es-CO"/>
+        </w:rPr>
+      </w:pPr>
+      <w:r>
+        <w:rPr>
+          <w:b/>
+          <w:lang w:eastAsia="es-CO"/>
+        </w:rPr>
         <w:t>Ahorro en recursos críticos (agua, suelo, materias primas)</w:t>
       </w:r>
     </w:p>
     <w:p>
       <w:pPr>
+        <w:spacing w:before="0" w:after="0"/>
         <w:rPr>
           <w:lang w:eastAsia="es-CO"/>
         </w:rPr>
@@ -3661,6 +3588,7 @@
           <w:b/>
           <w:lang w:eastAsia="es-CO"/>
         </w:rPr>
+        <w:lastRenderedPageBreak/>
         <w:t>Agua (m³):</w:t>
       </w:r>
       <w:r>
@@ -3722,6 +3650,7 @@
     </w:p>
     <w:p>
       <w:pPr>
+        <w:spacing w:before="0" w:after="0"/>
         <w:rPr>
           <w:lang w:eastAsia="es-CO"/>
         </w:rPr>
@@ -3740,6 +3669,7 @@
           <w:ilvl w:val="0"/>
           <w:numId w:val="9"/>
         </w:numPr>
+        <w:spacing w:before="0" w:after="0"/>
         <w:rPr>
           <w:b/>
           <w:lang w:eastAsia="es-CO"/>
@@ -3854,6 +3784,7 @@
     <w:p>
       <w:pPr>
         <w:rPr>
+          <w:b/>
           <w:lang w:eastAsia="es-CO"/>
         </w:rPr>
       </w:pPr>
@@ -3928,6 +3859,40 @@
           <w:lang w:eastAsia="es-CO"/>
         </w:rPr>
         <w:tab/>
+      </w:r>
+      <w:r>
+        <w:rPr>
+          <w:b/>
+          <w:lang w:eastAsia="es-CO"/>
+        </w:rPr>
+        <w:t>Cálculo de la reducción de CO₂</w:t>
+      </w:r>
+    </w:p>
+    <w:p>
+      <w:pPr>
+        <w:rPr>
+          <w:lang w:eastAsia="es-CO"/>
+        </w:rPr>
+      </w:pPr>
+      <w:r>
+        <w:rPr>
+          <w:lang w:eastAsia="es-CO"/>
+        </w:rPr>
+        <w:t>Se aplica la fórmula base: reducción de GEI (</w:t>
+      </w:r>
+      <w:proofErr w:type="spellStart"/>
+      <w:r>
+        <w:rPr>
+          <w:lang w:eastAsia="es-CO"/>
+        </w:rPr>
+        <w:t>tCO</w:t>
+      </w:r>
+      <w:proofErr w:type="spellEnd"/>
+      <w:r>
+        <w:rPr>
+          <w:lang w:eastAsia="es-CO"/>
+        </w:rPr>
+        <w:t>₂) = ahorro de energía × factor de emisión. Esto permite identificar el beneficio climático directo del proyecto.</w:t>
       </w:r>
     </w:p>
     <w:p>
@@ -3947,80 +3912,35 @@
           <w:b/>
           <w:lang w:eastAsia="es-CO"/>
         </w:rPr>
+        <w:t>Contribución a la huella de carbono</w:t>
+      </w:r>
+    </w:p>
+    <w:p>
+      <w:pPr>
+        <w:spacing w:before="0" w:after="0"/>
+        <w:rPr>
+          <w:lang w:eastAsia="es-CO"/>
+        </w:rPr>
+      </w:pPr>
+      <w:r>
+        <w:rPr>
+          <w:lang w:eastAsia="es-CO"/>
+        </w:rPr>
+        <w:t>El CO₂ evitado reduce proporcionalmente la huella de carbono de la organización.</w:t>
+      </w:r>
+    </w:p>
+    <w:p>
+      <w:pPr>
+        <w:spacing w:before="0" w:after="0"/>
+        <w:rPr>
+          <w:lang w:eastAsia="es-CO"/>
+        </w:rPr>
+      </w:pPr>
+      <w:r>
+        <w:rPr>
+          <w:lang w:eastAsia="es-CO"/>
+        </w:rPr>
         <w:lastRenderedPageBreak/>
-        <w:t>Cálculo de la reducción de CO₂</w:t>
-      </w:r>
-    </w:p>
-    <w:p>
-      <w:pPr>
-        <w:rPr>
-          <w:lang w:eastAsia="es-CO"/>
-        </w:rPr>
-      </w:pPr>
-      <w:r>
-        <w:rPr>
-          <w:lang w:eastAsia="es-CO"/>
-        </w:rPr>
-        <w:t>Se aplica la fórmula base: reducción de GEI (</w:t>
-      </w:r>
-      <w:proofErr w:type="spellStart"/>
-      <w:r>
-        <w:rPr>
-          <w:lang w:eastAsia="es-CO"/>
-        </w:rPr>
-        <w:t>tCO</w:t>
-      </w:r>
-      <w:proofErr w:type="spellEnd"/>
-      <w:r>
-        <w:rPr>
-          <w:lang w:eastAsia="es-CO"/>
-        </w:rPr>
-        <w:t>₂) = ahorro de energía × factor de emisión. Esto permite identificar el beneficio climático directo del proyecto.</w:t>
-      </w:r>
-    </w:p>
-    <w:p>
-      <w:pPr>
-        <w:pStyle w:val="Prrafodelista"/>
-        <w:numPr>
-          <w:ilvl w:val="0"/>
-          <w:numId w:val="15"/>
-        </w:numPr>
-        <w:rPr>
-          <w:b/>
-          <w:lang w:eastAsia="es-CO"/>
-        </w:rPr>
-      </w:pPr>
-      <w:r>
-        <w:rPr>
-          <w:b/>
-          <w:lang w:eastAsia="es-CO"/>
-        </w:rPr>
-        <w:t>Contribución a la huella de carbono</w:t>
-      </w:r>
-    </w:p>
-    <w:p>
-      <w:pPr>
-        <w:rPr>
-          <w:lang w:eastAsia="es-CO"/>
-        </w:rPr>
-      </w:pPr>
-      <w:r>
-        <w:rPr>
-          <w:lang w:eastAsia="es-CO"/>
-        </w:rPr>
-        <w:t>El CO₂ evitado reduce proporcionalmente la huella de carbono de la organización.</w:t>
-      </w:r>
-    </w:p>
-    <w:p>
-      <w:pPr>
-        <w:rPr>
-          <w:lang w:eastAsia="es-CO"/>
-        </w:rPr>
-      </w:pPr>
-      <w:r>
-        <w:rPr>
-          <w:lang w:eastAsia="es-CO"/>
-        </w:rPr>
         <w:t>El profesional aprende a:</w:t>
       </w:r>
     </w:p>
@@ -4088,6 +4008,7 @@
           <w:ilvl w:val="0"/>
           <w:numId w:val="15"/>
         </w:numPr>
+        <w:spacing w:before="0" w:after="0"/>
         <w:rPr>
           <w:b/>
           <w:lang w:eastAsia="es-CO"/>
@@ -4103,6 +4024,7 @@
     </w:p>
     <w:p>
       <w:pPr>
+        <w:spacing w:before="0" w:after="0"/>
         <w:rPr>
           <w:lang w:eastAsia="es-CO"/>
         </w:rPr>
@@ -4126,19 +4048,11 @@
           <w:lang w:eastAsia="es-CO"/>
         </w:rPr>
       </w:pPr>
-      <w:proofErr w:type="spellStart"/>
-      <w:r>
-        <w:rPr>
-          <w:lang w:eastAsia="es-CO"/>
-        </w:rPr>
-        <w:t>NOx</w:t>
-      </w:r>
-      <w:proofErr w:type="spellEnd"/>
-      <w:r>
-        <w:rPr>
-          <w:lang w:eastAsia="es-CO"/>
-        </w:rPr>
-        <w:t>.</w:t>
+      <w:r>
+        <w:rPr>
+          <w:lang w:eastAsia="es-CO"/>
+        </w:rPr>
+        <w:t>NOx.</w:t>
       </w:r>
     </w:p>
     <w:p>
@@ -4153,19 +4067,11 @@
           <w:lang w:eastAsia="es-CO"/>
         </w:rPr>
       </w:pPr>
-      <w:proofErr w:type="spellStart"/>
-      <w:r>
-        <w:rPr>
-          <w:lang w:eastAsia="es-CO"/>
-        </w:rPr>
-        <w:t>SOx</w:t>
-      </w:r>
-      <w:proofErr w:type="spellEnd"/>
-      <w:r>
-        <w:rPr>
-          <w:lang w:eastAsia="es-CO"/>
-        </w:rPr>
-        <w:t>.</w:t>
+      <w:r>
+        <w:rPr>
+          <w:lang w:eastAsia="es-CO"/>
+        </w:rPr>
+        <w:t>SOx.</w:t>
       </w:r>
     </w:p>
     <w:p>
@@ -4184,25 +4090,12 @@
         <w:rPr>
           <w:lang w:eastAsia="es-CO"/>
         </w:rPr>
-        <w:t xml:space="preserve">Material </w:t>
-      </w:r>
-      <w:proofErr w:type="spellStart"/>
-      <w:r>
-        <w:rPr>
-          <w:lang w:eastAsia="es-CO"/>
-        </w:rPr>
-        <w:t>particulado</w:t>
-      </w:r>
-      <w:proofErr w:type="spellEnd"/>
-      <w:r>
-        <w:rPr>
-          <w:lang w:eastAsia="es-CO"/>
-        </w:rPr>
-        <w:t xml:space="preserve"> (MP).</w:t>
-      </w:r>
-    </w:p>
-    <w:p>
-      <w:pPr>
+        <w:t>Material particulado (MP).</w:t>
+      </w:r>
+    </w:p>
+    <w:p>
+      <w:pPr>
+        <w:spacing w:before="0" w:after="0"/>
         <w:rPr>
           <w:lang w:eastAsia="es-CO"/>
         </w:rPr>
@@ -4227,6 +4120,7 @@
           <w:ilvl w:val="0"/>
           <w:numId w:val="14"/>
         </w:numPr>
+        <w:spacing w:before="0" w:after="0"/>
         <w:rPr>
           <w:b/>
           <w:lang w:eastAsia="es-CO"/>
@@ -4270,7 +4164,6 @@
           <w:b/>
           <w:lang w:eastAsia="es-CO"/>
         </w:rPr>
-        <w:lastRenderedPageBreak/>
         <w:t>Relación con el Análisis de Ciclo de Vida (ACV)</w:t>
       </w:r>
       <w:r>
@@ -4318,16 +4211,8 @@
         <w:rPr>
           <w:lang w:eastAsia="es-CO"/>
         </w:rPr>
-        <w:t xml:space="preserve">“El ahorro de X </w:t>
-      </w:r>
-      <w:proofErr w:type="spellStart"/>
-      <w:r>
-        <w:rPr>
-          <w:lang w:eastAsia="es-CO"/>
-        </w:rPr>
-        <w:t>kWh</w:t>
-      </w:r>
-      <w:proofErr w:type="spellEnd"/>
+        <w:t>“El ahorro de X kWh</w:t>
+      </w:r>
       <w:r>
         <w:rPr>
           <w:lang w:eastAsia="es-CO"/>
@@ -4376,11 +4261,13 @@
           <w:b/>
           <w:lang w:eastAsia="es-CO"/>
         </w:rPr>
+        <w:lastRenderedPageBreak/>
         <w:t>Reducción del déficit ecológico</w:t>
       </w:r>
     </w:p>
     <w:p>
       <w:pPr>
+        <w:spacing w:before="0" w:after="0"/>
         <w:rPr>
           <w:lang w:eastAsia="es-CO"/>
         </w:rPr>
@@ -4394,6 +4281,7 @@
     </w:p>
     <w:p>
       <w:pPr>
+        <w:spacing w:before="0" w:after="0"/>
         <w:rPr>
           <w:lang w:eastAsia="es-CO"/>
         </w:rPr>
@@ -4418,6 +4306,7 @@
           <w:ilvl w:val="0"/>
           <w:numId w:val="14"/>
         </w:numPr>
+        <w:spacing w:before="0" w:after="0"/>
         <w:rPr>
           <w:b/>
           <w:lang w:eastAsia="es-CO"/>
@@ -4433,6 +4322,7 @@
     </w:p>
     <w:p>
       <w:pPr>
+        <w:spacing w:before="0" w:after="0"/>
         <w:rPr>
           <w:lang w:eastAsia="es-CO"/>
         </w:rPr>
@@ -4504,7 +4394,7 @@
     <w:p>
       <w:pPr>
         <w:pStyle w:val="Ttulo2"/>
-        <w:spacing w:line="360" w:lineRule="auto"/>
+        <w:spacing w:before="0" w:after="0" w:line="360" w:lineRule="auto"/>
       </w:pPr>
       <w:bookmarkStart w:id="6" w:name="_Toc223941899"/>
       <w:r>
@@ -4514,22 +4404,16 @@
     </w:p>
     <w:p>
       <w:pPr>
-        <w:rPr>
-          <w:lang w:eastAsia="es-CO"/>
-        </w:rPr>
-      </w:pPr>
-      <w:r>
-        <w:rPr>
-          <w:lang w:eastAsia="es-CO"/>
-        </w:rPr>
-        <w:t xml:space="preserve">Una estrategia de sostenibilidad no se limita únicamente a mejorar la eficiencia energética; también requiere integrar fuentes de energía limpias que reduzcan la dependencia de combustibles fósiles. Este tema ofrece las bases técnicas necesarias </w:t>
-      </w:r>
-      <w:r>
-        <w:rPr>
-          <w:lang w:eastAsia="es-CO"/>
-        </w:rPr>
-        <w:lastRenderedPageBreak/>
-        <w:t>para comprender cómo funcionan las energías renovables y cómo seleccionar la alternativa más adecuada según las necesidades y el contexto del proyecto.</w:t>
+        <w:spacing w:before="0" w:after="0"/>
+        <w:rPr>
+          <w:lang w:eastAsia="es-CO"/>
+        </w:rPr>
+      </w:pPr>
+      <w:r>
+        <w:rPr>
+          <w:lang w:eastAsia="es-CO"/>
+        </w:rPr>
+        <w:t>Una estrategia de sostenibilidad no se limita únicamente a mejorar la eficiencia energética; también requiere integrar fuentes de energía limpias que reduzcan la dependencia de combustibles fósiles. Este tema ofrece las bases técnicas necesarias para comprender cómo funcionan las energías renovables y cómo seleccionar la alternativa más adecuada según las necesidades y el contexto del proyecto.</w:t>
       </w:r>
     </w:p>
     <w:p>
@@ -4539,6 +4423,7 @@
           <w:ilvl w:val="0"/>
           <w:numId w:val="14"/>
         </w:numPr>
+        <w:spacing w:before="0" w:after="0"/>
         <w:rPr>
           <w:b/>
           <w:lang w:eastAsia="es-CO"/>
@@ -4554,6 +4439,7 @@
     </w:p>
     <w:p>
       <w:pPr>
+        <w:spacing w:before="0" w:after="0"/>
         <w:rPr>
           <w:lang w:eastAsia="es-CO"/>
         </w:rPr>
@@ -4572,6 +4458,7 @@
           <w:ilvl w:val="0"/>
           <w:numId w:val="14"/>
         </w:numPr>
+        <w:spacing w:before="0" w:after="0"/>
         <w:rPr>
           <w:b/>
           <w:lang w:eastAsia="es-CO"/>
@@ -4605,15 +4492,17 @@
           <w:ilvl w:val="1"/>
           <w:numId w:val="16"/>
         </w:numPr>
-        <w:rPr>
-          <w:lang w:eastAsia="es-CO"/>
-        </w:rPr>
-      </w:pPr>
-      <w:r>
-        <w:rPr>
-          <w:b/>
-          <w:lang w:eastAsia="es-CO"/>
-        </w:rPr>
+        <w:spacing w:before="0" w:after="0"/>
+        <w:rPr>
+          <w:lang w:eastAsia="es-CO"/>
+        </w:rPr>
+      </w:pPr>
+      <w:r>
+        <w:rPr>
+          <w:b/>
+          <w:lang w:eastAsia="es-CO"/>
+        </w:rPr>
+        <w:lastRenderedPageBreak/>
         <w:t>Solar:</w:t>
       </w:r>
       <w:r>
@@ -4630,6 +4519,7 @@
           <w:ilvl w:val="1"/>
           <w:numId w:val="16"/>
         </w:numPr>
+        <w:spacing w:before="0" w:after="0"/>
         <w:rPr>
           <w:lang w:eastAsia="es-CO"/>
         </w:rPr>
@@ -4655,6 +4545,7 @@
           <w:ilvl w:val="1"/>
           <w:numId w:val="16"/>
         </w:numPr>
+        <w:spacing w:before="0" w:after="0"/>
         <w:rPr>
           <w:lang w:eastAsia="es-CO"/>
         </w:rPr>
@@ -4680,6 +4571,7 @@
           <w:ilvl w:val="1"/>
           <w:numId w:val="16"/>
         </w:numPr>
+        <w:spacing w:before="0" w:after="0"/>
         <w:rPr>
           <w:lang w:eastAsia="es-CO"/>
         </w:rPr>
@@ -4705,6 +4597,7 @@
           <w:ilvl w:val="1"/>
           <w:numId w:val="16"/>
         </w:numPr>
+        <w:spacing w:before="0" w:after="0"/>
         <w:rPr>
           <w:lang w:eastAsia="es-CO"/>
         </w:rPr>
@@ -4725,6 +4618,7 @@
     </w:p>
     <w:p>
       <w:pPr>
+        <w:spacing w:before="0" w:after="0"/>
         <w:rPr>
           <w:lang w:eastAsia="es-CO"/>
         </w:rPr>
@@ -4743,6 +4637,7 @@
           <w:ilvl w:val="0"/>
           <w:numId w:val="14"/>
         </w:numPr>
+        <w:spacing w:before="0" w:after="0"/>
         <w:rPr>
           <w:b/>
           <w:lang w:eastAsia="es-CO"/>
@@ -4758,6 +4653,7 @@
     </w:p>
     <w:p>
       <w:pPr>
+        <w:spacing w:before="0" w:after="0"/>
         <w:rPr>
           <w:lang w:eastAsia="es-CO"/>
         </w:rPr>
@@ -4771,6 +4667,7 @@
     </w:p>
     <w:p>
       <w:pPr>
+        <w:spacing w:before="0" w:after="0"/>
         <w:rPr>
           <w:lang w:eastAsia="es-CO"/>
         </w:rPr>
@@ -4789,17 +4686,17 @@
           <w:ilvl w:val="0"/>
           <w:numId w:val="14"/>
         </w:numPr>
-        <w:rPr>
-          <w:b/>
-          <w:lang w:eastAsia="es-CO"/>
-        </w:rPr>
-      </w:pPr>
-      <w:r>
-        <w:rPr>
-          <w:b/>
-          <w:lang w:eastAsia="es-CO"/>
-        </w:rPr>
-        <w:lastRenderedPageBreak/>
+        <w:spacing w:before="0" w:after="0"/>
+        <w:rPr>
+          <w:b/>
+          <w:lang w:eastAsia="es-CO"/>
+        </w:rPr>
+      </w:pPr>
+      <w:r>
+        <w:rPr>
+          <w:b/>
+          <w:lang w:eastAsia="es-CO"/>
+        </w:rPr>
         <w:t>Energía solar fotovoltaica</w:t>
       </w:r>
     </w:p>
@@ -4810,6 +4707,7 @@
           <w:ilvl w:val="1"/>
           <w:numId w:val="19"/>
         </w:numPr>
+        <w:spacing w:before="0" w:after="0"/>
         <w:rPr>
           <w:lang w:eastAsia="es-CO"/>
         </w:rPr>
@@ -4842,6 +4740,7 @@
           <w:ilvl w:val="1"/>
           <w:numId w:val="19"/>
         </w:numPr>
+        <w:spacing w:before="0" w:after="0"/>
         <w:rPr>
           <w:lang w:eastAsia="es-CO"/>
         </w:rPr>
@@ -4874,6 +4773,7 @@
           <w:ilvl w:val="1"/>
           <w:numId w:val="19"/>
         </w:numPr>
+        <w:spacing w:before="0" w:after="0"/>
         <w:rPr>
           <w:lang w:eastAsia="es-CO"/>
         </w:rPr>
@@ -4906,6 +4806,7 @@
           <w:ilvl w:val="1"/>
           <w:numId w:val="19"/>
         </w:numPr>
+        <w:spacing w:before="0" w:after="0"/>
         <w:rPr>
           <w:lang w:eastAsia="es-CO"/>
         </w:rPr>
@@ -4933,6 +4834,7 @@
     </w:p>
     <w:p>
       <w:pPr>
+        <w:spacing w:before="0" w:after="0"/>
         <w:rPr>
           <w:lang w:eastAsia="es-CO"/>
         </w:rPr>
@@ -4943,6 +4845,22 @@
         </w:rPr>
         <w:t>Este mismo esquema (captura, conversión y transformación) se aplica a todas las energías renovables, adaptándose a la naturaleza de cada fuente.</w:t>
       </w:r>
+    </w:p>
+    <w:p>
+      <w:pPr>
+        <w:spacing w:before="0" w:after="0"/>
+        <w:rPr>
+          <w:lang w:eastAsia="es-CO"/>
+        </w:rPr>
+      </w:pPr>
+    </w:p>
+    <w:p>
+      <w:pPr>
+        <w:spacing w:before="0" w:after="0"/>
+        <w:rPr>
+          <w:lang w:eastAsia="es-CO"/>
+        </w:rPr>
+      </w:pPr>
     </w:p>
     <w:p>
       <w:pPr>
@@ -4961,11 +4879,13 @@
           <w:b/>
           <w:lang w:eastAsia="es-CO"/>
         </w:rPr>
+        <w:lastRenderedPageBreak/>
         <w:t>Diferenciación de tipos de energía renovable</w:t>
       </w:r>
     </w:p>
     <w:p>
       <w:pPr>
+        <w:spacing w:before="0" w:after="0"/>
         <w:rPr>
           <w:lang w:eastAsia="es-CO"/>
         </w:rPr>
@@ -4984,6 +4904,7 @@
           <w:ilvl w:val="0"/>
           <w:numId w:val="14"/>
         </w:numPr>
+        <w:spacing w:before="0" w:after="0"/>
         <w:rPr>
           <w:b/>
           <w:lang w:eastAsia="es-CO"/>
@@ -5004,6 +4925,7 @@
           <w:ilvl w:val="1"/>
           <w:numId w:val="16"/>
         </w:numPr>
+        <w:spacing w:before="0" w:after="0"/>
         <w:rPr>
           <w:lang w:eastAsia="es-CO"/>
         </w:rPr>
@@ -5029,6 +4951,7 @@
           <w:ilvl w:val="1"/>
           <w:numId w:val="16"/>
         </w:numPr>
+        <w:spacing w:before="0" w:after="0"/>
         <w:rPr>
           <w:lang w:eastAsia="es-CO"/>
         </w:rPr>
@@ -5045,12 +4968,6 @@
           <w:lang w:eastAsia="es-CO"/>
         </w:rPr>
         <w:t>aprovecha el calor del sol para calentar agua o aire. En su versión concentrada (CSP), genera vapor para mover turbinas y producir electricidad.</w:t>
-      </w:r>
-      <w:r>
-        <w:rPr>
-          <w:lang w:eastAsia="es-CO"/>
-        </w:rPr>
-        <w:tab/>
       </w:r>
       <w:r>
         <w:rPr>
@@ -5108,22 +5025,23 @@
           <w:ilvl w:val="0"/>
           <w:numId w:val="14"/>
         </w:numPr>
-        <w:rPr>
-          <w:b/>
-          <w:lang w:eastAsia="es-CO"/>
-        </w:rPr>
-      </w:pPr>
-      <w:r>
-        <w:rPr>
-          <w:b/>
-          <w:lang w:eastAsia="es-CO"/>
-        </w:rPr>
-        <w:lastRenderedPageBreak/>
+        <w:spacing w:before="0" w:after="0"/>
+        <w:rPr>
+          <w:b/>
+          <w:lang w:eastAsia="es-CO"/>
+        </w:rPr>
+      </w:pPr>
+      <w:r>
+        <w:rPr>
+          <w:b/>
+          <w:lang w:eastAsia="es-CO"/>
+        </w:rPr>
         <w:t>Energía eólica</w:t>
       </w:r>
     </w:p>
     <w:p>
       <w:pPr>
+        <w:spacing w:before="0" w:after="0"/>
         <w:rPr>
           <w:lang w:eastAsia="es-CO"/>
         </w:rPr>
@@ -5142,6 +5060,7 @@
           <w:ilvl w:val="1"/>
           <w:numId w:val="16"/>
         </w:numPr>
+        <w:spacing w:before="0" w:after="0"/>
         <w:rPr>
           <w:lang w:eastAsia="es-CO"/>
         </w:rPr>
@@ -5180,6 +5099,7 @@
           <w:ilvl w:val="1"/>
           <w:numId w:val="16"/>
         </w:numPr>
+        <w:spacing w:before="0" w:after="0"/>
         <w:rPr>
           <w:lang w:eastAsia="es-CO"/>
         </w:rPr>
@@ -5212,6 +5132,7 @@
           <w:ilvl w:val="0"/>
           <w:numId w:val="14"/>
         </w:numPr>
+        <w:spacing w:before="0" w:after="0"/>
         <w:rPr>
           <w:b/>
           <w:lang w:eastAsia="es-CO"/>
@@ -5227,6 +5148,7 @@
     </w:p>
     <w:p>
       <w:pPr>
+        <w:spacing w:before="0" w:after="0"/>
         <w:rPr>
           <w:lang w:eastAsia="es-CO"/>
         </w:rPr>
@@ -5245,6 +5167,7 @@
           <w:ilvl w:val="1"/>
           <w:numId w:val="16"/>
         </w:numPr>
+        <w:spacing w:before="0" w:after="0"/>
         <w:rPr>
           <w:lang w:eastAsia="es-CO"/>
         </w:rPr>
@@ -5270,6 +5193,7 @@
           <w:ilvl w:val="1"/>
           <w:numId w:val="16"/>
         </w:numPr>
+        <w:spacing w:before="0" w:after="0"/>
         <w:rPr>
           <w:lang w:eastAsia="es-CO"/>
         </w:rPr>
@@ -5295,21 +5219,24 @@
           <w:ilvl w:val="0"/>
           <w:numId w:val="14"/>
         </w:numPr>
-        <w:rPr>
-          <w:b/>
-          <w:lang w:eastAsia="es-CO"/>
-        </w:rPr>
-      </w:pPr>
-      <w:r>
-        <w:rPr>
-          <w:b/>
-          <w:lang w:eastAsia="es-CO"/>
-        </w:rPr>
+        <w:spacing w:before="0"/>
+        <w:rPr>
+          <w:b/>
+          <w:lang w:eastAsia="es-CO"/>
+        </w:rPr>
+      </w:pPr>
+      <w:r>
+        <w:rPr>
+          <w:b/>
+          <w:lang w:eastAsia="es-CO"/>
+        </w:rPr>
+        <w:lastRenderedPageBreak/>
         <w:t>Bioenergía y biomasa</w:t>
       </w:r>
     </w:p>
     <w:p>
       <w:pPr>
+        <w:spacing w:before="0"/>
         <w:rPr>
           <w:lang w:eastAsia="es-CO"/>
         </w:rPr>
@@ -5346,6 +5273,7 @@
           <w:ilvl w:val="0"/>
           <w:numId w:val="14"/>
         </w:numPr>
+        <w:spacing w:before="0"/>
         <w:rPr>
           <w:b/>
           <w:lang w:eastAsia="es-CO"/>
@@ -5361,6 +5289,7 @@
     </w:p>
     <w:p>
       <w:pPr>
+        <w:spacing w:before="0"/>
         <w:rPr>
           <w:lang w:eastAsia="es-CO"/>
         </w:rPr>
@@ -5379,6 +5308,7 @@
           <w:ilvl w:val="0"/>
           <w:numId w:val="14"/>
         </w:numPr>
+        <w:spacing w:before="0"/>
         <w:rPr>
           <w:b/>
           <w:lang w:eastAsia="es-CO"/>
@@ -5450,22 +5380,23 @@
     </w:p>
     <w:p>
       <w:pPr>
-        <w:rPr>
-          <w:b/>
-          <w:lang w:eastAsia="es-CO"/>
-        </w:rPr>
-      </w:pPr>
-      <w:r>
-        <w:rPr>
-          <w:b/>
-          <w:lang w:eastAsia="es-CO"/>
-        </w:rPr>
-        <w:lastRenderedPageBreak/>
+        <w:spacing w:before="0"/>
+        <w:rPr>
+          <w:b/>
+          <w:lang w:eastAsia="es-CO"/>
+        </w:rPr>
+      </w:pPr>
+      <w:r>
+        <w:rPr>
+          <w:b/>
+          <w:lang w:eastAsia="es-CO"/>
+        </w:rPr>
         <w:t>Criterios para la evaluación de sitios y asociación del potencial de generación con condiciones geográficas y recursos disponibles</w:t>
       </w:r>
     </w:p>
     <w:p>
       <w:pPr>
+        <w:spacing w:before="0"/>
         <w:rPr>
           <w:lang w:eastAsia="es-CO"/>
         </w:rPr>
@@ -5484,6 +5415,7 @@
           <w:ilvl w:val="0"/>
           <w:numId w:val="14"/>
         </w:numPr>
+        <w:spacing w:before="0"/>
         <w:rPr>
           <w:lang w:eastAsia="es-CO"/>
         </w:rPr>
@@ -5509,6 +5441,7 @@
           <w:ilvl w:val="1"/>
           <w:numId w:val="16"/>
         </w:numPr>
+        <w:spacing w:before="0"/>
         <w:rPr>
           <w:lang w:eastAsia="es-CO"/>
         </w:rPr>
@@ -5548,21 +5481,7 @@
         <w:rPr>
           <w:lang w:eastAsia="es-CO"/>
         </w:rPr>
-        <w:t xml:space="preserve">) en el sitio. Un lugar se considera viable si presenta altos niveles de </w:t>
-      </w:r>
-      <w:proofErr w:type="spellStart"/>
-      <w:r>
-        <w:rPr>
-          <w:lang w:eastAsia="es-CO"/>
-        </w:rPr>
-        <w:t>irradiancia</w:t>
-      </w:r>
-      <w:proofErr w:type="spellEnd"/>
-      <w:r>
-        <w:rPr>
-          <w:lang w:eastAsia="es-CO"/>
-        </w:rPr>
-        <w:t xml:space="preserve"> promedio anual, lo cual está directamente relacionado con la latitud y la nubosidad.</w:t>
+        <w:t>) en el sitio. Un lugar se considera viable si presenta altos niveles de irradiancia promedio anual, lo cual está directamente relacionado con la latitud y la nubosidad.</w:t>
       </w:r>
     </w:p>
     <w:p>
@@ -5581,6 +5500,7 @@
           <w:b/>
           <w:lang w:eastAsia="es-CO"/>
         </w:rPr>
+        <w:lastRenderedPageBreak/>
         <w:t xml:space="preserve">Energía eólica: </w:t>
       </w:r>
       <w:r>
@@ -5681,7 +5601,6 @@
           <w:b/>
           <w:lang w:eastAsia="es-CO"/>
         </w:rPr>
-        <w:lastRenderedPageBreak/>
         <w:t xml:space="preserve">Factores ambientales y regulatorios: </w:t>
       </w:r>
       <w:r>
@@ -5783,6 +5702,7 @@
           <w:b/>
           <w:lang w:eastAsia="es-CO"/>
         </w:rPr>
+        <w:lastRenderedPageBreak/>
         <w:t>Análisis de riesgos climáticos:</w:t>
       </w:r>
       <w:r>
@@ -5821,21 +5741,7 @@
         <w:rPr>
           <w:lang w:eastAsia="es-CO"/>
         </w:rPr>
-        <w:t xml:space="preserve"> se utilizan herramientas de simulación </w:t>
-      </w:r>
-      <w:proofErr w:type="gramStart"/>
-      <w:r>
-        <w:rPr>
-          <w:lang w:eastAsia="es-CO"/>
-        </w:rPr>
-        <w:t>como</w:t>
-      </w:r>
-      <w:proofErr w:type="gramEnd"/>
-      <w:r>
-        <w:rPr>
-          <w:lang w:eastAsia="es-CO"/>
-        </w:rPr>
-        <w:t xml:space="preserve"> </w:t>
+        <w:t xml:space="preserve"> se utilizan herramientas de simulación como </w:t>
       </w:r>
       <w:proofErr w:type="spellStart"/>
       <w:r>
@@ -5873,7 +5779,6 @@
       </w:pPr>
       <w:bookmarkStart w:id="7" w:name="_Toc223941900"/>
       <w:r>
-        <w:lastRenderedPageBreak/>
         <w:t>Evaluación crítica del ciclo de vida en la generación renovable</w:t>
       </w:r>
       <w:bookmarkEnd w:id="7"/>
@@ -5953,7 +5858,14 @@
         <w:rPr>
           <w:lang w:eastAsia="es-CO"/>
         </w:rPr>
-        <w:t>la instalación de parques solares o eólicos requiere superficies extensas. Esto puede generar fragmentación de hábitats, pérdida de cobertura vegetal y afectación de la biodiversidad. En el caso de la energía eólica, existe además riesgo de colisión de aves y murciélagos con las turbinas.</w:t>
+        <w:t xml:space="preserve">la instalación de parques solares o eólicos requiere superficies extensas. Esto puede generar fragmentación de </w:t>
+      </w:r>
+      <w:r>
+        <w:rPr>
+          <w:lang w:eastAsia="es-CO"/>
+        </w:rPr>
+        <w:lastRenderedPageBreak/>
+        <w:t>hábitats, pérdida de cobertura vegetal y afectación de la biodiversidad. En el caso de la energía eólica, existe además riesgo de colisión de aves y murciélagos con las turbinas.</w:t>
       </w:r>
     </w:p>
     <w:p>
@@ -6018,14 +5930,7 @@
         <w:rPr>
           <w:lang w:eastAsia="es-CO"/>
         </w:rPr>
-        <w:t xml:space="preserve">la producción de paneles fotovoltaicos, baterías o convertidores electrónicos es </w:t>
-      </w:r>
-      <w:r>
-        <w:rPr>
-          <w:lang w:eastAsia="es-CO"/>
-        </w:rPr>
-        <w:lastRenderedPageBreak/>
-        <w:t>intensiva en el consumo de agua y energía. La purificación del silicio, por ejemplo, requiere altas temperaturas y</w:t>
+        <w:t>la producción de paneles fotovoltaicos, baterías o convertidores electrónicos es intensiva en el consumo de agua y energía. La purificación del silicio, por ejemplo, requiere altas temperaturas y</w:t>
       </w:r>
       <w:r>
         <w:rPr>
@@ -6111,21 +6016,7 @@
         <w:rPr>
           <w:lang w:eastAsia="es-CO"/>
         </w:rPr>
-        <w:t xml:space="preserve">las tecnologías renovables dependen de minerales estratégicos como litio, cobalto, níquel y tierras raras. La extracción de estos materiales puede producir contaminación del agua, degradación del suelo, emisiones significativas y conflictos </w:t>
-      </w:r>
-      <w:proofErr w:type="spellStart"/>
-      <w:r>
-        <w:rPr>
-          <w:lang w:eastAsia="es-CO"/>
-        </w:rPr>
-        <w:t>socioambientales</w:t>
-      </w:r>
-      <w:proofErr w:type="spellEnd"/>
-      <w:r>
-        <w:rPr>
-          <w:lang w:eastAsia="es-CO"/>
-        </w:rPr>
-        <w:t xml:space="preserve"> en los territorios donde se explotan. Estos efectos deben integrarse en el ACV para evitar decisiones de diseño que desplacen el impacto.</w:t>
+        <w:t>las tecnologías renovables dependen de minerales estratégicos como litio, cobalto, níquel y tierras raras. La extracción de estos materiales puede producir contaminación del agua, degradación del suelo, emisiones significativas y conflictos socioambientales en los territorios donde se explotan. Estos efectos deben integrarse en el ACV para evitar decisiones de diseño que desplacen el impacto.</w:t>
       </w:r>
     </w:p>
     <w:p>
@@ -6144,6 +6035,7 @@
           <w:b/>
           <w:lang w:eastAsia="es-CO"/>
         </w:rPr>
+        <w:lastRenderedPageBreak/>
         <w:t>Residuos tecnológicos (</w:t>
       </w:r>
       <w:r>
@@ -6181,68 +6073,68 @@
       </w:pPr>
       <w:bookmarkStart w:id="8" w:name="_Toc223941901"/>
       <w:r>
+        <w:t>Justificación de estrategias de economía circular para componentes de generación renovable</w:t>
+      </w:r>
+      <w:bookmarkEnd w:id="8"/>
+    </w:p>
+    <w:p>
+      <w:r>
+        <w:t>Para reducir la huella ambiental y evitar la transferencia de impactos, los proyectos deben integrar estrategias de economía circular desde su fase de diseño.</w:t>
+      </w:r>
+    </w:p>
+    <w:p>
+      <w:r>
+        <w:t xml:space="preserve">• </w:t>
+      </w:r>
+      <w:r>
+        <w:rPr>
+          <w:b/>
+        </w:rPr>
+        <w:t>Logística inversa y retorno de componentes</w:t>
+      </w:r>
+      <w:r>
+        <w:t>: el plan debe asegurar que los módulos fotovoltaicos, baterías y palas eólicas sean retornados a centros especializados para su desmontaje, reciclaje o valorización. La logística inversa garantiza la trazabilidad y evita que los residuos terminen en vertederos.</w:t>
+      </w:r>
+    </w:p>
+    <w:p>
+      <w:pPr>
+        <w:rPr>
+          <w:b/>
+        </w:rPr>
+      </w:pPr>
+      <w:r>
+        <w:rPr>
+          <w:b/>
+        </w:rPr>
+        <w:t>• Recuperación de materiales estratégicos:</w:t>
+      </w:r>
+      <w:r>
+        <w:rPr>
+          <w:b/>
+        </w:rPr>
+        <w:t xml:space="preserve"> </w:t>
+      </w:r>
+      <w:r>
+        <w:t>se deben justificar procesos que permitan recuperar silicio, aluminio, vidrio, cobre, imanes y metales críticos para reincorporarlos al ciclo productivo. Esto reduce la demanda de minería primaria y disminuye la huella ecológica del proyecto.</w:t>
+      </w:r>
+    </w:p>
+    <w:p>
+      <w:r>
+        <w:t xml:space="preserve">• </w:t>
+      </w:r>
+      <w:r>
+        <w:rPr>
+          <w:b/>
+        </w:rPr>
+        <w:t>Extensión de la vida útil (reutilización y reparación):</w:t>
+      </w:r>
+      <w:r>
+        <w:t xml:space="preserve"> antes de reemplazar equipos, se deben priorizar acciones como reparación, reacondicionamiento o actualización tecnológica. Este enfoque alarga la vida útil, disminuye el impacto ambiental acumulado y mejora la eficiencia económica del sistema.</w:t>
+      </w:r>
+    </w:p>
+    <w:p>
+      <w:r>
         <w:lastRenderedPageBreak/>
-        <w:t>Justificación de estrategias de economía circular para componentes de generación renovable</w:t>
-      </w:r>
-      <w:bookmarkEnd w:id="8"/>
-    </w:p>
-    <w:p>
-      <w:r>
-        <w:t>Para reducir la huella ambiental y evitar la transferencia de impactos, los proyectos deben integrar estrategias de economía circular desde su fase de diseño.</w:t>
-      </w:r>
-    </w:p>
-    <w:p>
-      <w:r>
-        <w:t xml:space="preserve">• </w:t>
-      </w:r>
-      <w:r>
-        <w:rPr>
-          <w:b/>
-        </w:rPr>
-        <w:t>Logística inversa y retorno de componentes</w:t>
-      </w:r>
-      <w:r>
-        <w:t>: el plan debe asegurar que los módulos fotovoltaicos, baterías y palas eólicas sean retornados a centros especializados para su desmontaje, reciclaje o valorización. La logística inversa garantiza la trazabilidad y evita que los residuos terminen en vertederos.</w:t>
-      </w:r>
-    </w:p>
-    <w:p>
-      <w:pPr>
-        <w:rPr>
-          <w:b/>
-        </w:rPr>
-      </w:pPr>
-      <w:r>
-        <w:rPr>
-          <w:b/>
-        </w:rPr>
-        <w:t>• Recuperación de materiales estratégicos:</w:t>
-      </w:r>
-      <w:r>
-        <w:rPr>
-          <w:b/>
-        </w:rPr>
-        <w:t xml:space="preserve"> </w:t>
-      </w:r>
-      <w:r>
-        <w:t>se deben justificar procesos que permitan recuperar silicio, aluminio, vidrio, cobre, imanes y metales críticos para reincorporarlos al ciclo productivo. Esto reduce la demanda de minería primaria y disminuye la huella ecológica del proyecto.</w:t>
-      </w:r>
-    </w:p>
-    <w:p>
-      <w:r>
-        <w:t xml:space="preserve">• </w:t>
-      </w:r>
-      <w:r>
-        <w:rPr>
-          <w:b/>
-        </w:rPr>
-        <w:t>Extensión de la vida útil (reutilización y reparación):</w:t>
-      </w:r>
-      <w:r>
-        <w:t xml:space="preserve"> antes de reemplazar equipos, se deben priorizar acciones como reparación, reacondicionamiento o actualización tecnológica. Este enfoque alarga la vida útil, disminuye el impacto ambiental acumulado y mejora la eficiencia económica del sistema.</w:t>
-      </w:r>
-    </w:p>
-    <w:p>
-      <w:r>
         <w:t>En el centro de la gestión energética sostenible se encuentra la comprensión del ciclo completo de los materiales y tecnologías. La combinación de ACV y economía circular permite que los sistemas renovables no solo reduzcan emisiones, sino que también minimicen impactos asociados a la extracción, manufactura y disposición final, garantizando una transición energé</w:t>
       </w:r>
       <w:r>
@@ -6437,77 +6329,25 @@
         </w:rPr>
         <w:tab/>
       </w:r>
-      <w:r>
-        <w:rPr>
-          <w:lang w:eastAsia="es-CO"/>
-        </w:rPr>
-        <w:tab/>
-      </w:r>
-      <w:r>
-        <w:rPr>
-          <w:lang w:eastAsia="es-CO"/>
-        </w:rPr>
-        <w:tab/>
-      </w:r>
-      <w:r>
-        <w:rPr>
-          <w:lang w:eastAsia="es-CO"/>
-        </w:rPr>
-        <w:tab/>
-      </w:r>
-      <w:r>
-        <w:rPr>
-          <w:lang w:eastAsia="es-CO"/>
-        </w:rPr>
-        <w:tab/>
-      </w:r>
-      <w:r>
-        <w:rPr>
-          <w:lang w:eastAsia="es-CO"/>
-        </w:rPr>
-        <w:tab/>
-      </w:r>
-      <w:r>
-        <w:rPr>
-          <w:lang w:eastAsia="es-CO"/>
-        </w:rPr>
-        <w:tab/>
-      </w:r>
-      <w:r>
-        <w:rPr>
-          <w:lang w:eastAsia="es-CO"/>
-        </w:rPr>
-        <w:tab/>
-      </w:r>
-      <w:r>
-        <w:rPr>
-          <w:lang w:eastAsia="es-CO"/>
-        </w:rPr>
-        <w:tab/>
-      </w:r>
-      <w:r>
-        <w:rPr>
-          <w:lang w:eastAsia="es-CO"/>
-        </w:rPr>
-        <w:tab/>
-      </w:r>
-      <w:r>
-        <w:rPr>
+    </w:p>
+    <w:p>
+      <w:pPr>
+        <w:ind w:firstLine="284"/>
+        <w:rPr>
+          <w:lang w:eastAsia="es-CO"/>
+        </w:rPr>
+      </w:pPr>
+      <w:r>
+        <w:rPr>
+          <w:noProof/>
           <w:lang w:eastAsia="es-CO"/>
         </w:rPr>
         <w:lastRenderedPageBreak/>
-        <w:tab/>
-      </w:r>
-      <w:r>
-        <w:rPr>
-          <w:noProof/>
-          <w:lang w:eastAsia="es-CO"/>
-        </w:rPr>
         <w:drawing>
-          <wp:inline distT="0" distB="0" distL="0" distR="0" wp14:anchorId="65025A5F" wp14:editId="1816B67B">
-            <wp:extent cx="6332220" cy="4116705"/>
-            <wp:effectExtent l="0" t="0" r="0" b="0"/>
-            <wp:docPr id="5" name="Imagen 5" descr="Se presentan etapas del análisis de viabilidad, eficiencia y evaluación de impactos en procesos energéticos, con recuadros y flechas que describen aspectos como eficiencia energética, viabilidad económica, reducción de GEI, energías renovables, evaluación del ciclo de vida y participación comunitaria."/>
+          <wp:inline distT="0" distB="0" distL="0" distR="0" wp14:anchorId="0A1A9803" wp14:editId="30A6946E">
+            <wp:extent cx="6184423" cy="4814335"/>
+            <wp:effectExtent l="0" t="0" r="0" b="5715"/>
+            <wp:docPr id="1804445441" name="Imagen 5" descr="Se presentan etapas del análisis de viabilidad, eficiencia y evaluación de impactos en procesos energéticos, con recuadros y flechas que describen aspectos como eficiencia energética, viabilidad económica, reducción de GEI, energías renovables, evaluación del ciclo de vida y participación comunitaria."/>
             <wp:cNvGraphicFramePr>
               <a:graphicFrameLocks xmlns:a="http://schemas.openxmlformats.org/drawingml/2006/main" noChangeAspect="1"/>
             </wp:cNvGraphicFramePr>
@@ -6515,8 +6355,10 @@
               <a:graphicData uri="http://schemas.openxmlformats.org/drawingml/2006/picture">
                 <pic:pic xmlns:pic="http://schemas.openxmlformats.org/drawingml/2006/picture">
                   <pic:nvPicPr>
-                    <pic:cNvPr id="5" name="F446E07.tmp"/>
-                    <pic:cNvPicPr/>
+                    <pic:cNvPr id="1804445441" name="Imagen 5" descr="Se presentan etapas del análisis de viabilidad, eficiencia y evaluación de impactos en procesos energéticos, con recuadros y flechas que describen aspectos como eficiencia energética, viabilidad económica, reducción de GEI, energías renovables, evaluación del ciclo de vida y participación comunitaria."/>
+                    <pic:cNvPicPr>
+                      <a:picLocks noChangeAspect="1" noChangeArrowheads="1"/>
+                    </pic:cNvPicPr>
                   </pic:nvPicPr>
                   <pic:blipFill>
                     <a:blip r:embed="rId13">
@@ -6526,18 +6368,20 @@
                         </a:ext>
                       </a:extLst>
                     </a:blip>
+                    <a:srcRect/>
                     <a:stretch>
                       <a:fillRect/>
                     </a:stretch>
                   </pic:blipFill>
-                  <pic:spPr>
+                  <pic:spPr bwMode="auto">
                     <a:xfrm>
                       <a:off x="0" y="0"/>
-                      <a:ext cx="6332220" cy="4116705"/>
+                      <a:ext cx="6196574" cy="4823794"/>
                     </a:xfrm>
                     <a:prstGeom prst="rect">
                       <a:avLst/>
                     </a:prstGeom>
+                    <a:noFill/>
                   </pic:spPr>
                 </pic:pic>
               </a:graphicData>
@@ -6545,6 +6389,66 @@
           </wp:inline>
         </w:drawing>
       </w:r>
+      <w:r>
+        <w:rPr>
+          <w:lang w:eastAsia="es-CO"/>
+        </w:rPr>
+        <w:tab/>
+      </w:r>
+      <w:r>
+        <w:rPr>
+          <w:lang w:eastAsia="es-CO"/>
+        </w:rPr>
+        <w:tab/>
+      </w:r>
+      <w:r>
+        <w:rPr>
+          <w:lang w:eastAsia="es-CO"/>
+        </w:rPr>
+        <w:tab/>
+      </w:r>
+      <w:r>
+        <w:rPr>
+          <w:lang w:eastAsia="es-CO"/>
+        </w:rPr>
+        <w:tab/>
+      </w:r>
+      <w:r>
+        <w:rPr>
+          <w:lang w:eastAsia="es-CO"/>
+        </w:rPr>
+        <w:tab/>
+      </w:r>
+      <w:r>
+        <w:rPr>
+          <w:lang w:eastAsia="es-CO"/>
+        </w:rPr>
+        <w:tab/>
+      </w:r>
+      <w:r>
+        <w:rPr>
+          <w:lang w:eastAsia="es-CO"/>
+        </w:rPr>
+        <w:tab/>
+      </w:r>
+      <w:r>
+        <w:rPr>
+          <w:lang w:eastAsia="es-CO"/>
+        </w:rPr>
+        <w:tab/>
+      </w:r>
+      <w:r>
+        <w:rPr>
+          <w:lang w:eastAsia="es-CO"/>
+        </w:rPr>
+        <w:tab/>
+      </w:r>
+      <w:r>
+        <w:rPr>
+          <w:lang w:eastAsia="es-CO"/>
+        </w:rPr>
+        <w:tab/>
+      </w:r>
     </w:p>
     <w:p>
       <w:pPr>
@@ -6563,12 +6467,7 @@
       <w:bookmarkStart w:id="11" w:name="_Toc223941903"/>
       <w:r>
         <w:lastRenderedPageBreak/>
-        <w:t>Gl</w:t>
-      </w:r>
-      <w:bookmarkStart w:id="12" w:name="_GoBack"/>
-      <w:bookmarkEnd w:id="12"/>
-      <w:r>
-        <w:t>osario</w:t>
+        <w:t>Glosario</w:t>
       </w:r>
       <w:bookmarkEnd w:id="10"/>
       <w:bookmarkEnd w:id="11"/>
@@ -6580,7 +6479,6 @@
           <w:lang w:eastAsia="es-CO"/>
         </w:rPr>
       </w:pPr>
-      <w:proofErr w:type="spellStart"/>
       <w:r>
         <w:rPr>
           <w:b/>
@@ -6588,7 +6486,6 @@
         </w:rPr>
         <w:t>Biocapacidad</w:t>
       </w:r>
-      <w:proofErr w:type="spellEnd"/>
       <w:r>
         <w:rPr>
           <w:b/>
@@ -7117,8 +7014,8 @@
           <w:lang w:val="es-MX"/>
         </w:rPr>
       </w:pPr>
-      <w:bookmarkStart w:id="13" w:name="_Toc176443726"/>
-      <w:bookmarkStart w:id="14" w:name="_Toc223941904"/>
+      <w:bookmarkStart w:id="12" w:name="_Toc176443726"/>
+      <w:bookmarkStart w:id="13" w:name="_Toc223941904"/>
       <w:r>
         <w:rPr>
           <w:lang w:val="es-MX"/>
@@ -7126,8 +7023,8 @@
         <w:lastRenderedPageBreak/>
         <w:t>Referencias bibliográficas</w:t>
       </w:r>
+      <w:bookmarkEnd w:id="12"/>
       <w:bookmarkEnd w:id="13"/>
-      <w:bookmarkEnd w:id="14"/>
     </w:p>
     <w:p>
       <w:pPr>
@@ -7139,20 +7036,157 @@
         <w:rPr>
           <w:lang w:val="es-MX" w:eastAsia="es-CO"/>
         </w:rPr>
-        <w:t xml:space="preserve">Agencia Internacional de la Energía (IEA). (2023). </w:t>
+        <w:t xml:space="preserve">Agencia Internacional de la Energía (IEA). (2023). World Energy </w:t>
+      </w:r>
+      <w:r>
+        <w:rPr>
+          <w:lang w:val="es-MX" w:eastAsia="es-CO"/>
+        </w:rPr>
+        <w:t xml:space="preserve">Outlook 2023. IEA </w:t>
       </w:r>
       <w:proofErr w:type="spellStart"/>
       <w:r>
         <w:rPr>
           <w:lang w:val="es-MX" w:eastAsia="es-CO"/>
         </w:rPr>
-        <w:t>World</w:t>
+        <w:t>Publications</w:t>
       </w:r>
       <w:proofErr w:type="spellEnd"/>
       <w:r>
         <w:rPr>
           <w:lang w:val="es-MX" w:eastAsia="es-CO"/>
         </w:rPr>
+        <w:t>.</w:t>
+      </w:r>
+    </w:p>
+    <w:p>
+      <w:pPr>
+        <w:rPr>
+          <w:lang w:val="es-MX" w:eastAsia="es-CO"/>
+        </w:rPr>
+      </w:pPr>
+      <w:r>
+        <w:rPr>
+          <w:lang w:val="es-MX" w:eastAsia="es-CO"/>
+        </w:rPr>
+        <w:t>Comisión Mundial sobre Medio Ambiente y Desarrollo. (1987). Nuestro fut</w:t>
+      </w:r>
+      <w:r>
+        <w:rPr>
+          <w:lang w:val="es-MX" w:eastAsia="es-CO"/>
+        </w:rPr>
+        <w:t>uro común (Informe Brundtland).</w:t>
+      </w:r>
+    </w:p>
+    <w:p>
+      <w:pPr>
+        <w:rPr>
+          <w:lang w:val="es-MX" w:eastAsia="es-CO"/>
+        </w:rPr>
+      </w:pPr>
+      <w:r>
+        <w:rPr>
+          <w:lang w:val="es-MX" w:eastAsia="es-CO"/>
+        </w:rPr>
+        <w:t xml:space="preserve">Ellen MacArthur </w:t>
+      </w:r>
+      <w:proofErr w:type="spellStart"/>
+      <w:r>
+        <w:rPr>
+          <w:lang w:val="es-MX" w:eastAsia="es-CO"/>
+        </w:rPr>
+        <w:t>Foundation</w:t>
+      </w:r>
+      <w:proofErr w:type="spellEnd"/>
+      <w:r>
+        <w:rPr>
+          <w:lang w:val="es-MX" w:eastAsia="es-CO"/>
+        </w:rPr>
+        <w:t>. (2017). Introducción a la economía ci</w:t>
+      </w:r>
+      <w:r>
+        <w:rPr>
+          <w:lang w:val="es-MX" w:eastAsia="es-CO"/>
+        </w:rPr>
+        <w:t>rcular.</w:t>
+      </w:r>
+    </w:p>
+    <w:p>
+      <w:pPr>
+        <w:rPr>
+          <w:lang w:val="es-MX" w:eastAsia="es-CO"/>
+        </w:rPr>
+      </w:pPr>
+      <w:r>
+        <w:rPr>
+          <w:lang w:val="es-MX" w:eastAsia="es-CO"/>
+        </w:rPr>
+        <w:t xml:space="preserve">Global </w:t>
+      </w:r>
+      <w:proofErr w:type="spellStart"/>
+      <w:r>
+        <w:rPr>
+          <w:lang w:val="es-MX" w:eastAsia="es-CO"/>
+        </w:rPr>
+        <w:t>Footprint</w:t>
+      </w:r>
+      <w:proofErr w:type="spellEnd"/>
+      <w:r>
+        <w:rPr>
+          <w:lang w:val="es-MX" w:eastAsia="es-CO"/>
+        </w:rPr>
+        <w:t xml:space="preserve"> Network. (2024). Huella ecológica: conc</w:t>
+      </w:r>
+      <w:r>
+        <w:rPr>
+          <w:lang w:val="es-MX" w:eastAsia="es-CO"/>
+        </w:rPr>
+        <w:t>eptos, medición y aplicaciones.</w:t>
+      </w:r>
+    </w:p>
+    <w:p>
+      <w:pPr>
+        <w:rPr>
+          <w:lang w:val="es-MX" w:eastAsia="es-CO"/>
+        </w:rPr>
+      </w:pPr>
+      <w:r>
+        <w:rPr>
+          <w:lang w:val="es-MX" w:eastAsia="es-CO"/>
+        </w:rPr>
+        <w:t>Ministerio de Ambiente y Desarrollo Sostenible (MADS) de Colombia. (2019). Guía metodológica para la eval</w:t>
+      </w:r>
+      <w:r>
+        <w:rPr>
+          <w:lang w:val="es-MX" w:eastAsia="es-CO"/>
+        </w:rPr>
+        <w:t>uación de impactos ambientales.</w:t>
+      </w:r>
+    </w:p>
+    <w:p>
+      <w:pPr>
+        <w:rPr>
+          <w:lang w:val="es-MX" w:eastAsia="es-CO"/>
+        </w:rPr>
+      </w:pPr>
+      <w:r>
+        <w:rPr>
+          <w:lang w:val="es-MX" w:eastAsia="es-CO"/>
+        </w:rPr>
+        <w:t xml:space="preserve">UNEP, GRID-Arendal. (2018). Energy and </w:t>
+      </w:r>
+      <w:proofErr w:type="spellStart"/>
+      <w:r>
+        <w:rPr>
+          <w:lang w:val="es-MX" w:eastAsia="es-CO"/>
+        </w:rPr>
+        <w:t>the</w:t>
+      </w:r>
+      <w:proofErr w:type="spellEnd"/>
+      <w:r>
+        <w:rPr>
+          <w:lang w:val="es-MX" w:eastAsia="es-CO"/>
+        </w:rPr>
         <w:t xml:space="preserve"> </w:t>
       </w:r>
       <w:proofErr w:type="spellStart"/>
@@ -7160,7 +7194,7 @@
         <w:rPr>
           <w:lang w:val="es-MX" w:eastAsia="es-CO"/>
         </w:rPr>
-        <w:t>Energy</w:t>
+        <w:t>Sustainable</w:t>
       </w:r>
       <w:proofErr w:type="spellEnd"/>
       <w:r>
@@ -7169,24 +7203,60 @@
         </w:rPr>
         <w:t xml:space="preserve"> </w:t>
       </w:r>
+      <w:proofErr w:type="spellStart"/>
       <w:r>
         <w:rPr>
           <w:lang w:val="es-MX" w:eastAsia="es-CO"/>
         </w:rPr>
-        <w:t xml:space="preserve">Outlook 2023. IEA </w:t>
+        <w:t>Development</w:t>
+      </w:r>
+      <w:proofErr w:type="spellEnd"/>
+      <w:r>
+        <w:rPr>
+          <w:lang w:val="es-MX" w:eastAsia="es-CO"/>
+        </w:rPr>
+        <w:t xml:space="preserve"> Goals: </w:t>
       </w:r>
       <w:proofErr w:type="spellStart"/>
       <w:r>
         <w:rPr>
           <w:lang w:val="es-MX" w:eastAsia="es-CO"/>
         </w:rPr>
-        <w:t>Publications</w:t>
+        <w:t>An</w:t>
       </w:r>
       <w:proofErr w:type="spellEnd"/>
       <w:r>
         <w:rPr>
           <w:lang w:val="es-MX" w:eastAsia="es-CO"/>
         </w:rPr>
+        <w:t xml:space="preserve"> </w:t>
+      </w:r>
+      <w:proofErr w:type="spellStart"/>
+      <w:r>
+        <w:rPr>
+          <w:lang w:val="es-MX" w:eastAsia="es-CO"/>
+        </w:rPr>
+        <w:t>Integrated</w:t>
+      </w:r>
+      <w:proofErr w:type="spellEnd"/>
+      <w:r>
+        <w:rPr>
+          <w:lang w:val="es-MX" w:eastAsia="es-CO"/>
+        </w:rPr>
+        <w:t xml:space="preserve"> </w:t>
+      </w:r>
+      <w:proofErr w:type="spellStart"/>
+      <w:r>
+        <w:rPr>
+          <w:lang w:val="es-MX" w:eastAsia="es-CO"/>
+        </w:rPr>
+        <w:t>Approach</w:t>
+      </w:r>
+      <w:proofErr w:type="spellEnd"/>
+      <w:r>
+        <w:rPr>
+          <w:lang w:val="es-MX" w:eastAsia="es-CO"/>
+        </w:rPr>
         <w:t>.</w:t>
       </w:r>
     </w:p>
@@ -7196,32 +7266,34 @@
           <w:lang w:val="es-MX" w:eastAsia="es-CO"/>
         </w:rPr>
       </w:pPr>
-      <w:r>
+    </w:p>
+    <w:p>
+      <w:pPr>
         <w:rPr>
           <w:lang w:val="es-MX" w:eastAsia="es-CO"/>
         </w:rPr>
-        <w:t>Comisión Mundial sobre Medio Ambiente y Desarrollo. (1987). Nuestro fut</w:t>
-      </w:r>
-      <w:r>
+      </w:pPr>
+    </w:p>
+    <w:p>
+      <w:pPr>
         <w:rPr>
           <w:lang w:val="es-MX" w:eastAsia="es-CO"/>
         </w:rPr>
-        <w:t xml:space="preserve">uro común (Informe </w:t>
-      </w:r>
-      <w:proofErr w:type="spellStart"/>
-      <w:r>
+      </w:pPr>
+    </w:p>
+    <w:p>
+      <w:pPr>
         <w:rPr>
           <w:lang w:val="es-MX" w:eastAsia="es-CO"/>
         </w:rPr>
-        <w:t>Brundtland</w:t>
-      </w:r>
-      <w:proofErr w:type="spellEnd"/>
-      <w:r>
+      </w:pPr>
+    </w:p>
+    <w:p>
+      <w:pPr>
         <w:rPr>
           <w:lang w:val="es-MX" w:eastAsia="es-CO"/>
         </w:rPr>
-        <w:t>).</w:t>
-      </w:r>
+      </w:pPr>
     </w:p>
     <w:p>
       <w:pPr>
@@ -7229,271 +7301,26 @@
           <w:lang w:val="es-MX" w:eastAsia="es-CO"/>
         </w:rPr>
       </w:pPr>
-      <w:r>
+    </w:p>
+    <w:p>
+      <w:pPr>
         <w:rPr>
           <w:lang w:val="es-MX" w:eastAsia="es-CO"/>
         </w:rPr>
-        <w:t xml:space="preserve">Ellen MacArthur </w:t>
-      </w:r>
-      <w:proofErr w:type="spellStart"/>
-      <w:r>
-        <w:rPr>
-          <w:lang w:val="es-MX" w:eastAsia="es-CO"/>
-        </w:rPr>
-        <w:t>Foundation</w:t>
-      </w:r>
-      <w:proofErr w:type="spellEnd"/>
-      <w:r>
-        <w:rPr>
-          <w:lang w:val="es-MX" w:eastAsia="es-CO"/>
-        </w:rPr>
-        <w:t>. (2017). Introducción a la economía ci</w:t>
-      </w:r>
-      <w:r>
-        <w:rPr>
-          <w:lang w:val="es-MX" w:eastAsia="es-CO"/>
-        </w:rPr>
-        <w:t>rcular.</w:t>
-      </w:r>
-    </w:p>
-    <w:p>
-      <w:pPr>
-        <w:rPr>
-          <w:lang w:val="es-MX" w:eastAsia="es-CO"/>
-        </w:rPr>
-      </w:pPr>
-      <w:r>
-        <w:rPr>
-          <w:lang w:val="es-MX" w:eastAsia="es-CO"/>
-        </w:rPr>
-        <w:t xml:space="preserve">Global </w:t>
-      </w:r>
-      <w:proofErr w:type="spellStart"/>
-      <w:r>
-        <w:rPr>
-          <w:lang w:val="es-MX" w:eastAsia="es-CO"/>
-        </w:rPr>
-        <w:t>Footprint</w:t>
-      </w:r>
-      <w:proofErr w:type="spellEnd"/>
-      <w:r>
-        <w:rPr>
-          <w:lang w:val="es-MX" w:eastAsia="es-CO"/>
-        </w:rPr>
-        <w:t xml:space="preserve"> Network. (2024). Huella ecológica: conc</w:t>
-      </w:r>
-      <w:r>
-        <w:rPr>
-          <w:lang w:val="es-MX" w:eastAsia="es-CO"/>
-        </w:rPr>
-        <w:t>eptos, medición y aplicaciones.</w:t>
-      </w:r>
-    </w:p>
-    <w:p>
-      <w:pPr>
-        <w:rPr>
-          <w:lang w:val="es-MX" w:eastAsia="es-CO"/>
-        </w:rPr>
-      </w:pPr>
-      <w:r>
-        <w:rPr>
-          <w:lang w:val="es-MX" w:eastAsia="es-CO"/>
-        </w:rPr>
-        <w:t>Ministerio de Ambiente y Desarrollo Sostenible (MADS) de Colombia. (2019). Guía metodológica para la eval</w:t>
-      </w:r>
-      <w:r>
-        <w:rPr>
-          <w:lang w:val="es-MX" w:eastAsia="es-CO"/>
-        </w:rPr>
-        <w:t>uación de impactos ambientales.</w:t>
-      </w:r>
-    </w:p>
-    <w:p>
-      <w:pPr>
-        <w:rPr>
-          <w:lang w:val="es-MX" w:eastAsia="es-CO"/>
-        </w:rPr>
-      </w:pPr>
-      <w:r>
-        <w:rPr>
-          <w:lang w:val="es-MX" w:eastAsia="es-CO"/>
-        </w:rPr>
-        <w:t xml:space="preserve">UNEP, GRID-Arendal. (2018). </w:t>
-      </w:r>
-      <w:proofErr w:type="spellStart"/>
-      <w:r>
-        <w:rPr>
-          <w:lang w:val="es-MX" w:eastAsia="es-CO"/>
-        </w:rPr>
-        <w:t>Energy</w:t>
-      </w:r>
-      <w:proofErr w:type="spellEnd"/>
-      <w:r>
-        <w:rPr>
-          <w:lang w:val="es-MX" w:eastAsia="es-CO"/>
-        </w:rPr>
-        <w:t xml:space="preserve"> and </w:t>
-      </w:r>
-      <w:proofErr w:type="spellStart"/>
-      <w:r>
-        <w:rPr>
-          <w:lang w:val="es-MX" w:eastAsia="es-CO"/>
-        </w:rPr>
-        <w:t>the</w:t>
-      </w:r>
-      <w:proofErr w:type="spellEnd"/>
-      <w:r>
-        <w:rPr>
-          <w:lang w:val="es-MX" w:eastAsia="es-CO"/>
-        </w:rPr>
-        <w:t xml:space="preserve"> </w:t>
-      </w:r>
-      <w:proofErr w:type="spellStart"/>
-      <w:r>
-        <w:rPr>
-          <w:lang w:val="es-MX" w:eastAsia="es-CO"/>
-        </w:rPr>
-        <w:t>Sustainable</w:t>
-      </w:r>
-      <w:proofErr w:type="spellEnd"/>
-      <w:r>
-        <w:rPr>
-          <w:lang w:val="es-MX" w:eastAsia="es-CO"/>
-        </w:rPr>
-        <w:t xml:space="preserve"> </w:t>
-      </w:r>
-      <w:proofErr w:type="spellStart"/>
-      <w:r>
-        <w:rPr>
-          <w:lang w:val="es-MX" w:eastAsia="es-CO"/>
-        </w:rPr>
-        <w:t>Development</w:t>
-      </w:r>
-      <w:proofErr w:type="spellEnd"/>
-      <w:r>
-        <w:rPr>
-          <w:lang w:val="es-MX" w:eastAsia="es-CO"/>
-        </w:rPr>
-        <w:t xml:space="preserve"> </w:t>
-      </w:r>
-      <w:proofErr w:type="spellStart"/>
-      <w:r>
-        <w:rPr>
-          <w:lang w:val="es-MX" w:eastAsia="es-CO"/>
-        </w:rPr>
-        <w:t>Goals</w:t>
-      </w:r>
-      <w:proofErr w:type="spellEnd"/>
-      <w:r>
-        <w:rPr>
-          <w:lang w:val="es-MX" w:eastAsia="es-CO"/>
-        </w:rPr>
-        <w:t xml:space="preserve">: </w:t>
-      </w:r>
-      <w:proofErr w:type="spellStart"/>
-      <w:r>
-        <w:rPr>
-          <w:lang w:val="es-MX" w:eastAsia="es-CO"/>
-        </w:rPr>
-        <w:t>An</w:t>
-      </w:r>
-      <w:proofErr w:type="spellEnd"/>
-      <w:r>
-        <w:rPr>
-          <w:lang w:val="es-MX" w:eastAsia="es-CO"/>
-        </w:rPr>
-        <w:t xml:space="preserve"> </w:t>
-      </w:r>
-      <w:proofErr w:type="spellStart"/>
-      <w:r>
-        <w:rPr>
-          <w:lang w:val="es-MX" w:eastAsia="es-CO"/>
-        </w:rPr>
-        <w:t>Integrated</w:t>
-      </w:r>
-      <w:proofErr w:type="spellEnd"/>
-      <w:r>
-        <w:rPr>
-          <w:lang w:val="es-MX" w:eastAsia="es-CO"/>
-        </w:rPr>
-        <w:t xml:space="preserve"> </w:t>
-      </w:r>
-      <w:proofErr w:type="spellStart"/>
-      <w:r>
-        <w:rPr>
-          <w:lang w:val="es-MX" w:eastAsia="es-CO"/>
-        </w:rPr>
-        <w:t>Approach</w:t>
-      </w:r>
-      <w:proofErr w:type="spellEnd"/>
-      <w:r>
-        <w:rPr>
-          <w:lang w:val="es-MX" w:eastAsia="es-CO"/>
-        </w:rPr>
-        <w:t>.</w:t>
-      </w:r>
-    </w:p>
-    <w:p>
-      <w:pPr>
-        <w:rPr>
-          <w:lang w:val="es-MX" w:eastAsia="es-CO"/>
-        </w:rPr>
-      </w:pPr>
-    </w:p>
-    <w:p>
-      <w:pPr>
-        <w:rPr>
-          <w:lang w:val="es-MX" w:eastAsia="es-CO"/>
-        </w:rPr>
-      </w:pPr>
-    </w:p>
-    <w:p>
-      <w:pPr>
-        <w:rPr>
-          <w:lang w:val="es-MX" w:eastAsia="es-CO"/>
-        </w:rPr>
-      </w:pPr>
-    </w:p>
-    <w:p>
-      <w:pPr>
-        <w:rPr>
-          <w:lang w:val="es-MX" w:eastAsia="es-CO"/>
-        </w:rPr>
-      </w:pPr>
-    </w:p>
-    <w:p>
-      <w:pPr>
-        <w:rPr>
-          <w:lang w:val="es-MX" w:eastAsia="es-CO"/>
-        </w:rPr>
-      </w:pPr>
-    </w:p>
-    <w:p>
-      <w:pPr>
-        <w:rPr>
-          <w:lang w:val="es-MX" w:eastAsia="es-CO"/>
-        </w:rPr>
-      </w:pPr>
-    </w:p>
-    <w:p>
-      <w:pPr>
-        <w:rPr>
-          <w:lang w:val="es-MX" w:eastAsia="es-CO"/>
-        </w:rPr>
       </w:pPr>
     </w:p>
     <w:p>
       <w:pPr>
         <w:pStyle w:val="Titulosgenerales"/>
       </w:pPr>
-      <w:bookmarkStart w:id="15" w:name="_Toc176443727"/>
-      <w:bookmarkStart w:id="16" w:name="_Toc223941905"/>
+      <w:bookmarkStart w:id="14" w:name="_Toc176443727"/>
+      <w:bookmarkStart w:id="15" w:name="_Toc223941905"/>
       <w:r>
         <w:lastRenderedPageBreak/>
         <w:t>Créditos</w:t>
       </w:r>
+      <w:bookmarkEnd w:id="14"/>
       <w:bookmarkEnd w:id="15"/>
-      <w:bookmarkEnd w:id="16"/>
     </w:p>
     <w:tbl>
       <w:tblPr>
@@ -7527,6 +7354,7 @@
           </w:tcPr>
           <w:p>
             <w:pPr>
+              <w:spacing w:before="0" w:after="0"/>
               <w:rPr>
                 <w:b/>
                 <w:lang w:val="es-ES_tradnl" w:eastAsia="es-CO"/>
@@ -7548,6 +7376,7 @@
           </w:tcPr>
           <w:p>
             <w:pPr>
+              <w:spacing w:before="0" w:after="0"/>
               <w:rPr>
                 <w:b/>
                 <w:lang w:val="es-ES_tradnl" w:eastAsia="es-CO"/>
@@ -7569,6 +7398,7 @@
           </w:tcPr>
           <w:p>
             <w:pPr>
+              <w:spacing w:before="0" w:after="0"/>
               <w:ind w:firstLine="0"/>
               <w:rPr>
                 <w:b/>
@@ -7596,6 +7426,7 @@
           </w:tcPr>
           <w:p>
             <w:pPr>
+              <w:spacing w:before="0" w:after="0"/>
               <w:ind w:firstLine="0"/>
               <w:rPr>
                 <w:rFonts w:asciiTheme="minorHAnsi" w:hAnsiTheme="minorHAnsi" w:cstheme="minorHAnsi"/>
@@ -7616,6 +7447,7 @@
           </w:tcPr>
           <w:p>
             <w:pPr>
+              <w:spacing w:before="0" w:after="0"/>
               <w:ind w:firstLine="0"/>
               <w:rPr>
                 <w:rFonts w:asciiTheme="minorHAnsi" w:hAnsiTheme="minorHAnsi" w:cstheme="minorHAnsi"/>
@@ -7636,6 +7468,7 @@
           </w:tcPr>
           <w:p>
             <w:pPr>
+              <w:spacing w:before="0" w:after="0"/>
               <w:ind w:firstLine="0"/>
               <w:rPr>
                 <w:rFonts w:asciiTheme="minorHAnsi" w:hAnsiTheme="minorHAnsi" w:cstheme="minorHAnsi"/>
@@ -7657,6 +7490,7 @@
           </w:tcPr>
           <w:p>
             <w:pPr>
+              <w:spacing w:before="0" w:after="0"/>
               <w:ind w:firstLine="0"/>
               <w:rPr>
                 <w:rFonts w:asciiTheme="minorHAnsi" w:hAnsiTheme="minorHAnsi" w:cstheme="minorHAnsi"/>
@@ -7676,6 +7510,7 @@
           </w:tcPr>
           <w:p>
             <w:pPr>
+              <w:spacing w:before="0" w:after="0"/>
               <w:ind w:firstLine="0"/>
               <w:rPr>
                 <w:rFonts w:asciiTheme="minorHAnsi" w:hAnsiTheme="minorHAnsi" w:cstheme="minorHAnsi"/>
@@ -7695,6 +7530,7 @@
           </w:tcPr>
           <w:p>
             <w:pPr>
+              <w:spacing w:before="0" w:after="0"/>
               <w:ind w:firstLine="0"/>
               <w:rPr>
                 <w:rFonts w:asciiTheme="minorHAnsi" w:hAnsiTheme="minorHAnsi" w:cstheme="minorHAnsi"/>
@@ -7704,15 +7540,7 @@
               </w:rPr>
             </w:pPr>
             <w:r>
-              <w:t xml:space="preserve">Centro </w:t>
-            </w:r>
-            <w:proofErr w:type="spellStart"/>
-            <w:r>
-              <w:t>Agroturístico</w:t>
-            </w:r>
-            <w:proofErr w:type="spellEnd"/>
-            <w:r>
-              <w:t xml:space="preserve"> - Regional Santander</w:t>
+              <w:t>Centro Agroturístico - Regional Santander</w:t>
             </w:r>
           </w:p>
         </w:tc>
@@ -7728,6 +7556,7 @@
           </w:tcPr>
           <w:p>
             <w:pPr>
+              <w:spacing w:before="0" w:after="0"/>
               <w:ind w:firstLine="0"/>
               <w:rPr>
                 <w:rFonts w:asciiTheme="minorHAnsi" w:hAnsiTheme="minorHAnsi" w:cstheme="minorHAnsi"/>
@@ -7736,19 +7565,9 @@
                 <w:lang w:val="es-ES" w:eastAsia="es-CO"/>
               </w:rPr>
             </w:pPr>
-            <w:proofErr w:type="spellStart"/>
             <w:r>
-              <w:t>Gianmarco</w:t>
+              <w:t>Gianmarco Serrano Cabarcas</w:t>
             </w:r>
-            <w:proofErr w:type="spellEnd"/>
-            <w:r>
-              <w:t xml:space="preserve"> Serrano </w:t>
-            </w:r>
-            <w:proofErr w:type="spellStart"/>
-            <w:r>
-              <w:t>Cabarcas</w:t>
-            </w:r>
-            <w:proofErr w:type="spellEnd"/>
           </w:p>
         </w:tc>
         <w:tc>
@@ -7758,6 +7577,7 @@
           </w:tcPr>
           <w:p>
             <w:pPr>
+              <w:spacing w:before="0" w:after="0"/>
               <w:ind w:firstLine="0"/>
               <w:rPr>
                 <w:rFonts w:asciiTheme="minorHAnsi" w:hAnsiTheme="minorHAnsi" w:cstheme="minorHAnsi"/>
@@ -7778,6 +7598,7 @@
           </w:tcPr>
           <w:p>
             <w:pPr>
+              <w:spacing w:before="0" w:after="0"/>
               <w:ind w:firstLine="0"/>
               <w:rPr>
                 <w:rFonts w:asciiTheme="minorHAnsi" w:hAnsiTheme="minorHAnsi" w:cstheme="minorHAnsi"/>
@@ -7787,15 +7608,7 @@
               </w:rPr>
             </w:pPr>
             <w:r>
-              <w:t xml:space="preserve">Centro </w:t>
-            </w:r>
-            <w:proofErr w:type="spellStart"/>
-            <w:r>
-              <w:t>Agroturístico</w:t>
-            </w:r>
-            <w:proofErr w:type="spellEnd"/>
-            <w:r>
-              <w:t xml:space="preserve"> - Regional Santander</w:t>
+              <w:t>Centro Agroturístico - Regional Santander</w:t>
             </w:r>
           </w:p>
         </w:tc>
@@ -7807,6 +7620,7 @@
           </w:tcPr>
           <w:p>
             <w:pPr>
+              <w:spacing w:before="0" w:after="0"/>
               <w:ind w:firstLine="0"/>
               <w:rPr>
                 <w:rFonts w:asciiTheme="minorHAnsi" w:hAnsiTheme="minorHAnsi" w:cstheme="minorHAnsi"/>
@@ -7826,6 +7640,7 @@
           </w:tcPr>
           <w:p>
             <w:pPr>
+              <w:spacing w:before="0" w:after="0"/>
               <w:ind w:firstLine="0"/>
               <w:rPr>
                 <w:rFonts w:asciiTheme="minorHAnsi" w:hAnsiTheme="minorHAnsi" w:cstheme="minorHAnsi"/>
@@ -7845,6 +7660,7 @@
           </w:tcPr>
           <w:p>
             <w:pPr>
+              <w:spacing w:before="0" w:after="0"/>
               <w:ind w:firstLine="0"/>
               <w:rPr>
                 <w:rFonts w:asciiTheme="minorHAnsi" w:hAnsiTheme="minorHAnsi" w:cstheme="minorHAnsi"/>
@@ -7854,15 +7670,7 @@
               </w:rPr>
             </w:pPr>
             <w:r>
-              <w:t xml:space="preserve">Centro </w:t>
-            </w:r>
-            <w:proofErr w:type="spellStart"/>
-            <w:r>
-              <w:t>Agroturístico</w:t>
-            </w:r>
-            <w:proofErr w:type="spellEnd"/>
-            <w:r>
-              <w:t xml:space="preserve"> - Regional Santander</w:t>
+              <w:t>Centro Agroturístico - Regional Santander</w:t>
             </w:r>
           </w:p>
         </w:tc>
@@ -7875,6 +7683,7 @@
           </w:tcPr>
           <w:p>
             <w:pPr>
+              <w:spacing w:before="0" w:after="0"/>
               <w:ind w:firstLine="0"/>
               <w:rPr>
                 <w:rFonts w:asciiTheme="minorHAnsi" w:hAnsiTheme="minorHAnsi" w:cstheme="minorHAnsi"/>
@@ -7895,6 +7704,7 @@
           </w:tcPr>
           <w:p>
             <w:pPr>
+              <w:spacing w:before="0" w:after="0"/>
               <w:ind w:firstLine="0"/>
               <w:rPr>
                 <w:rFonts w:asciiTheme="minorHAnsi" w:hAnsiTheme="minorHAnsi" w:cstheme="minorHAnsi"/>
@@ -7915,6 +7725,7 @@
           </w:tcPr>
           <w:p>
             <w:pPr>
+              <w:spacing w:before="0" w:after="0"/>
               <w:ind w:firstLine="0"/>
               <w:rPr>
                 <w:rFonts w:asciiTheme="minorHAnsi" w:hAnsiTheme="minorHAnsi" w:cstheme="minorHAnsi"/>
@@ -7924,15 +7735,7 @@
               </w:rPr>
             </w:pPr>
             <w:r>
-              <w:t xml:space="preserve">Centro </w:t>
-            </w:r>
-            <w:proofErr w:type="spellStart"/>
-            <w:r>
-              <w:t>Agroturístico</w:t>
-            </w:r>
-            <w:proofErr w:type="spellEnd"/>
-            <w:r>
-              <w:t xml:space="preserve"> - Regional Santander</w:t>
+              <w:t>Centro Agroturístico - Regional Santander</w:t>
             </w:r>
           </w:p>
         </w:tc>
@@ -7944,6 +7747,7 @@
           </w:tcPr>
           <w:p>
             <w:pPr>
+              <w:spacing w:before="0" w:after="0"/>
               <w:ind w:firstLine="0"/>
               <w:rPr>
                 <w:rFonts w:asciiTheme="minorHAnsi" w:hAnsiTheme="minorHAnsi" w:cstheme="minorHAnsi"/>
@@ -7952,13 +7756,8 @@
                 <w:lang w:val="es-ES" w:eastAsia="es-CO"/>
               </w:rPr>
             </w:pPr>
-            <w:proofErr w:type="spellStart"/>
             <w:r>
-              <w:t>Lizeth</w:t>
-            </w:r>
-            <w:proofErr w:type="spellEnd"/>
-            <w:r>
-              <w:t xml:space="preserve"> Karina Manchego Suarez</w:t>
+              <w:t>Lizeth Karina Manchego Suarez</w:t>
             </w:r>
           </w:p>
         </w:tc>
@@ -7968,6 +7767,7 @@
           </w:tcPr>
           <w:p>
             <w:pPr>
+              <w:spacing w:before="0" w:after="0"/>
               <w:ind w:firstLine="0"/>
               <w:rPr>
                 <w:rFonts w:asciiTheme="minorHAnsi" w:hAnsiTheme="minorHAnsi" w:cstheme="minorHAnsi"/>
@@ -7993,6 +7793,7 @@
           </w:tcPr>
           <w:p>
             <w:pPr>
+              <w:spacing w:before="0" w:after="0"/>
               <w:ind w:firstLine="0"/>
               <w:rPr>
                 <w:rFonts w:asciiTheme="minorHAnsi" w:hAnsiTheme="minorHAnsi" w:cstheme="minorHAnsi"/>
@@ -8002,15 +7803,7 @@
               </w:rPr>
             </w:pPr>
             <w:r>
-              <w:t xml:space="preserve">Centro </w:t>
-            </w:r>
-            <w:proofErr w:type="spellStart"/>
-            <w:r>
-              <w:t>Agroturístico</w:t>
-            </w:r>
-            <w:proofErr w:type="spellEnd"/>
-            <w:r>
-              <w:t xml:space="preserve"> - Regional Santander</w:t>
+              <w:t>Centro Agroturístico - Regional Santander</w:t>
             </w:r>
           </w:p>
         </w:tc>
@@ -8023,6 +7816,7 @@
           </w:tcPr>
           <w:p>
             <w:pPr>
+              <w:spacing w:before="0" w:after="0"/>
               <w:ind w:firstLine="0"/>
               <w:rPr>
                 <w:rFonts w:asciiTheme="minorHAnsi" w:hAnsiTheme="minorHAnsi" w:cstheme="minorHAnsi"/>
@@ -8031,11 +7825,9 @@
                 <w:lang w:val="es-ES" w:eastAsia="es-CO"/>
               </w:rPr>
             </w:pPr>
-            <w:proofErr w:type="spellStart"/>
             <w:r>
-              <w:t>Maria</w:t>
+              <w:t>María</w:t>
             </w:r>
-            <w:proofErr w:type="spellEnd"/>
             <w:r>
               <w:t xml:space="preserve"> Alejandra Vera Briceño</w:t>
             </w:r>
@@ -8048,6 +7840,7 @@
           </w:tcPr>
           <w:p>
             <w:pPr>
+              <w:spacing w:before="0" w:after="0"/>
               <w:ind w:firstLine="0"/>
               <w:rPr>
                 <w:rFonts w:asciiTheme="minorHAnsi" w:hAnsiTheme="minorHAnsi" w:cstheme="minorHAnsi"/>
@@ -8068,6 +7861,7 @@
           </w:tcPr>
           <w:p>
             <w:pPr>
+              <w:spacing w:before="0" w:after="0"/>
               <w:ind w:firstLine="0"/>
               <w:rPr>
                 <w:rFonts w:asciiTheme="minorHAnsi" w:hAnsiTheme="minorHAnsi" w:cstheme="minorHAnsi"/>
@@ -8077,15 +7871,7 @@
               </w:rPr>
             </w:pPr>
             <w:r>
-              <w:t xml:space="preserve">Centro </w:t>
-            </w:r>
-            <w:proofErr w:type="spellStart"/>
-            <w:r>
-              <w:t>Agroturístico</w:t>
-            </w:r>
-            <w:proofErr w:type="spellEnd"/>
-            <w:r>
-              <w:t xml:space="preserve"> - Regional Santander</w:t>
+              <w:t>Centro Agroturístico - Regional Santander</w:t>
             </w:r>
           </w:p>
         </w:tc>
@@ -8097,6 +7883,7 @@
           </w:tcPr>
           <w:p>
             <w:pPr>
+              <w:spacing w:before="0" w:after="0"/>
               <w:ind w:firstLine="0"/>
               <w:rPr>
                 <w:rFonts w:asciiTheme="minorHAnsi" w:hAnsiTheme="minorHAnsi" w:cstheme="minorHAnsi"/>
@@ -8116,6 +7903,7 @@
           </w:tcPr>
           <w:p>
             <w:pPr>
+              <w:spacing w:before="0" w:after="0"/>
               <w:ind w:firstLine="0"/>
               <w:rPr>
                 <w:rFonts w:asciiTheme="minorHAnsi" w:hAnsiTheme="minorHAnsi" w:cstheme="minorHAnsi"/>
@@ -8135,6 +7923,22 @@
           </w:tcPr>
           <w:p>
             <w:pPr>
+              <w:spacing w:before="0" w:after="0"/>
+              <w:ind w:firstLine="0"/>
+            </w:pPr>
+            <w:r>
+              <w:t xml:space="preserve">Centro Agroturístico </w:t>
+            </w:r>
+            <w:r>
+              <w:t>–</w:t>
+            </w:r>
+            <w:r>
+              <w:t xml:space="preserve"> Re</w:t>
+            </w:r>
+          </w:p>
+          <w:p>
+            <w:pPr>
+              <w:spacing w:before="0" w:after="0"/>
               <w:ind w:firstLine="0"/>
               <w:rPr>
                 <w:rFonts w:asciiTheme="minorHAnsi" w:hAnsiTheme="minorHAnsi" w:cstheme="minorHAnsi"/>
@@ -8143,16 +7947,13 @@
                 <w:lang w:val="es-ES" w:eastAsia="es-CO"/>
               </w:rPr>
             </w:pPr>
-            <w:r>
-              <w:t xml:space="preserve">Centro </w:t>
-            </w:r>
             <w:proofErr w:type="spellStart"/>
             <w:r>
-              <w:t>Agroturístico</w:t>
+              <w:t>gional</w:t>
             </w:r>
             <w:proofErr w:type="spellEnd"/>
             <w:r>
-              <w:t xml:space="preserve"> - Regional Santander</w:t>
+              <w:t xml:space="preserve"> Santander</w:t>
             </w:r>
           </w:p>
         </w:tc>
@@ -8165,6 +7966,7 @@
           </w:tcPr>
           <w:p>
             <w:pPr>
+              <w:spacing w:before="0" w:after="0"/>
               <w:ind w:firstLine="0"/>
               <w:rPr>
                 <w:rFonts w:asciiTheme="minorHAnsi" w:hAnsiTheme="minorHAnsi" w:cstheme="minorHAnsi"/>
@@ -8174,7 +7976,6 @@
               </w:rPr>
             </w:pPr>
             <w:r>
-              <w:lastRenderedPageBreak/>
               <w:t>Laura Paola Gelvez Manosalva</w:t>
             </w:r>
           </w:p>
@@ -8186,6 +7987,7 @@
           </w:tcPr>
           <w:p>
             <w:pPr>
+              <w:spacing w:before="0" w:after="0"/>
               <w:ind w:firstLine="0"/>
               <w:rPr>
                 <w:rFonts w:asciiTheme="minorHAnsi" w:hAnsiTheme="minorHAnsi" w:cstheme="minorHAnsi"/>
@@ -8212,6 +8014,7 @@
           </w:tcPr>
           <w:p>
             <w:pPr>
+              <w:spacing w:before="0" w:after="0"/>
               <w:ind w:firstLine="0"/>
               <w:rPr>
                 <w:rFonts w:asciiTheme="minorHAnsi" w:hAnsiTheme="minorHAnsi" w:cstheme="minorHAnsi"/>
@@ -8221,7 +8024,7 @@
               </w:rPr>
             </w:pPr>
             <w:r>
-              <w:t>Centro de Comercio y Servicios - Regional Tolima</w:t>
+              <w:t>Centro Agroturístico - Regional Santander</w:t>
             </w:r>
           </w:p>
         </w:tc>
@@ -8259,7 +8062,7 @@
 </file>
 
 <file path=word/endnotes.xml><?xml version="1.0" encoding="utf-8"?>
-<w:endnotes xmlns:wpc="http://schemas.microsoft.com/office/word/2010/wordprocessingCanvas" xmlns:mc="http://schemas.openxmlformats.org/markup-compatibility/2006" xmlns:o="urn:schemas-microsoft-com:office:office" xmlns:r="http://schemas.openxmlformats.org/officeDocument/2006/relationships" xmlns:m="http://schemas.openxmlformats.org/officeDocument/2006/math" xmlns:v="urn:schemas-microsoft-com:vml" xmlns:wp14="http://schemas.microsoft.com/office/word/2010/wordprocessingDrawing" xmlns:wp="http://schemas.openxmlformats.org/drawingml/2006/wordprocessingDrawing" xmlns:w10="urn:schemas-microsoft-com:office:word" xmlns:w="http://schemas.openxmlformats.org/wordprocessingml/2006/main" xmlns:w14="http://schemas.microsoft.com/office/word/2010/wordml" xmlns:w15="http://schemas.microsoft.com/office/word/2012/wordml" xmlns:wpg="http://schemas.microsoft.com/office/word/2010/wordprocessingGroup" xmlns:wpi="http://schemas.microsoft.com/office/word/2010/wordprocessingInk" xmlns:wne="http://schemas.microsoft.com/office/word/2006/wordml" xmlns:wps="http://schemas.microsoft.com/office/word/2010/wordprocessingShape" mc:Ignorable="w14 w15 wp14">
+<w:endnotes xmlns:wpc="http://schemas.microsoft.com/office/word/2010/wordprocessingCanvas" xmlns:cx="http://schemas.microsoft.com/office/drawing/2014/chartex" xmlns:cx1="http://schemas.microsoft.com/office/drawing/2015/9/8/chartex" xmlns:cx2="http://schemas.microsoft.com/office/drawing/2015/10/21/chartex" xmlns:cx3="http://schemas.microsoft.com/office/drawing/2016/5/9/chartex" xmlns:cx4="http://schemas.microsoft.com/office/drawing/2016/5/10/chartex" xmlns:cx5="http://schemas.microsoft.com/office/drawing/2016/5/11/chartex" xmlns:cx6="http://schemas.microsoft.com/office/drawing/2016/5/12/chartex" xmlns:cx7="http://schemas.microsoft.com/office/drawing/2016/5/13/chartex" xmlns:cx8="http://schemas.microsoft.com/office/drawing/2016/5/14/chartex" xmlns:mc="http://schemas.openxmlformats.org/markup-compatibility/2006" xmlns:aink="http://schemas.microsoft.com/office/drawing/2016/ink" xmlns:am3d="http://schemas.microsoft.com/office/drawing/2017/model3d" xmlns:o="urn:schemas-microsoft-com:office:office" xmlns:oel="http://schemas.microsoft.com/office/2019/extlst" xmlns:r="http://schemas.openxmlformats.org/officeDocument/2006/relationships" xmlns:m="http://schemas.openxmlformats.org/officeDocument/2006/math" xmlns:v="urn:schemas-microsoft-com:vml" xmlns:wp14="http://schemas.microsoft.com/office/word/2010/wordprocessingDrawing" xmlns:wp="http://schemas.openxmlformats.org/drawingml/2006/wordprocessingDrawing" xmlns:w10="urn:schemas-microsoft-com:office:word" xmlns:w="http://schemas.openxmlformats.org/wordprocessingml/2006/main" xmlns:w14="http://schemas.microsoft.com/office/word/2010/wordml" xmlns:w15="http://schemas.microsoft.com/office/word/2012/wordml" xmlns:w16cex="http://schemas.microsoft.com/office/word/2018/wordml/cex" xmlns:w16cid="http://schemas.microsoft.com/office/word/2016/wordml/cid" xmlns:w16="http://schemas.microsoft.com/office/word/2018/wordml" xmlns:w16du="http://schemas.microsoft.com/office/word/2023/wordml/word16du" xmlns:w16sdtdh="http://schemas.microsoft.com/office/word/2020/wordml/sdtdatahash" xmlns:w16sdtfl="http://schemas.microsoft.com/office/word/2024/wordml/sdtformatlock" xmlns:w16se="http://schemas.microsoft.com/office/word/2015/wordml/symex" xmlns:wpg="http://schemas.microsoft.com/office/word/2010/wordprocessingGroup" xmlns:wpi="http://schemas.microsoft.com/office/word/2010/wordprocessingInk" xmlns:wne="http://schemas.microsoft.com/office/word/2006/wordml" xmlns:wps="http://schemas.microsoft.com/office/word/2010/wordprocessingShape" mc:Ignorable="w14 w15 w16se w16cid w16 w16cex w16sdtdh w16sdtfl w16du wp14">
   <w:endnote w:type="separator" w:id="-1">
     <w:p>
       <w:pPr>
@@ -8284,7 +8087,7 @@
 </file>
 
 <file path=word/footer1.xml><?xml version="1.0" encoding="utf-8"?>
-<w:ftr xmlns:wpc="http://schemas.microsoft.com/office/word/2010/wordprocessingCanvas" xmlns:mc="http://schemas.openxmlformats.org/markup-compatibility/2006" xmlns:o="urn:schemas-microsoft-com:office:office" xmlns:r="http://schemas.openxmlformats.org/officeDocument/2006/relationships" xmlns:m="http://schemas.openxmlformats.org/officeDocument/2006/math" xmlns:v="urn:schemas-microsoft-com:vml" xmlns:wp14="http://schemas.microsoft.com/office/word/2010/wordprocessingDrawing" xmlns:wp="http://schemas.openxmlformats.org/drawingml/2006/wordprocessingDrawing" xmlns:w10="urn:schemas-microsoft-com:office:word" xmlns:w="http://schemas.openxmlformats.org/wordprocessingml/2006/main" xmlns:w14="http://schemas.microsoft.com/office/word/2010/wordml" xmlns:w15="http://schemas.microsoft.com/office/word/2012/wordml" xmlns:wpg="http://schemas.microsoft.com/office/word/2010/wordprocessingGroup" xmlns:wpi="http://schemas.microsoft.com/office/word/2010/wordprocessingInk" xmlns:wne="http://schemas.microsoft.com/office/word/2006/wordml" xmlns:wps="http://schemas.microsoft.com/office/word/2010/wordprocessingShape" mc:Ignorable="w14 w15 wp14">
+<w:ftr xmlns:wpc="http://schemas.microsoft.com/office/word/2010/wordprocessingCanvas" xmlns:cx="http://schemas.microsoft.com/office/drawing/2014/chartex" xmlns:cx1="http://schemas.microsoft.com/office/drawing/2015/9/8/chartex" xmlns:cx2="http://schemas.microsoft.com/office/drawing/2015/10/21/chartex" xmlns:cx3="http://schemas.microsoft.com/office/drawing/2016/5/9/chartex" xmlns:cx4="http://schemas.microsoft.com/office/drawing/2016/5/10/chartex" xmlns:cx5="http://schemas.microsoft.com/office/drawing/2016/5/11/chartex" xmlns:cx6="http://schemas.microsoft.com/office/drawing/2016/5/12/chartex" xmlns:cx7="http://schemas.microsoft.com/office/drawing/2016/5/13/chartex" xmlns:cx8="http://schemas.microsoft.com/office/drawing/2016/5/14/chartex" xmlns:mc="http://schemas.openxmlformats.org/markup-compatibility/2006" xmlns:aink="http://schemas.microsoft.com/office/drawing/2016/ink" xmlns:am3d="http://schemas.microsoft.com/office/drawing/2017/model3d" xmlns:o="urn:schemas-microsoft-com:office:office" xmlns:oel="http://schemas.microsoft.com/office/2019/extlst" xmlns:r="http://schemas.openxmlformats.org/officeDocument/2006/relationships" xmlns:m="http://schemas.openxmlformats.org/officeDocument/2006/math" xmlns:v="urn:schemas-microsoft-com:vml" xmlns:wp14="http://schemas.microsoft.com/office/word/2010/wordprocessingDrawing" xmlns:wp="http://schemas.openxmlformats.org/drawingml/2006/wordprocessingDrawing" xmlns:w10="urn:schemas-microsoft-com:office:word" xmlns:w="http://schemas.openxmlformats.org/wordprocessingml/2006/main" xmlns:w14="http://schemas.microsoft.com/office/word/2010/wordml" xmlns:w15="http://schemas.microsoft.com/office/word/2012/wordml" xmlns:w16cex="http://schemas.microsoft.com/office/word/2018/wordml/cex" xmlns:w16cid="http://schemas.microsoft.com/office/word/2016/wordml/cid" xmlns:w16="http://schemas.microsoft.com/office/word/2018/wordml" xmlns:w16du="http://schemas.microsoft.com/office/word/2023/wordml/word16du" xmlns:w16sdtdh="http://schemas.microsoft.com/office/word/2020/wordml/sdtdatahash" xmlns:w16sdtfl="http://schemas.microsoft.com/office/word/2024/wordml/sdtformatlock" xmlns:w16se="http://schemas.microsoft.com/office/word/2015/wordml/symex" xmlns:wpg="http://schemas.microsoft.com/office/word/2010/wordprocessingGroup" xmlns:wpi="http://schemas.microsoft.com/office/word/2010/wordprocessingInk" xmlns:wne="http://schemas.microsoft.com/office/word/2006/wordml" xmlns:wps="http://schemas.microsoft.com/office/word/2010/wordprocessingShape" mc:Ignorable="w14 w15 w16se w16cid w16 w16cex w16sdtdh w16sdtfl w16du wp14">
   <w:p>
     <w:pPr>
       <w:pStyle w:val="Piedepgina"/>
@@ -8372,7 +8175,7 @@
               <v:stroke joinstyle="miter"/>
               <v:path gradientshapeok="t" o:connecttype="rect"/>
             </v:shapetype>
-            <v:shape id="Cuadro de texto 1" o:spid="_x0000_s1027" type="#_x0000_t202" style="position:absolute;left:0;text-align:left;margin-left:16.1pt;margin-top:.65pt;width:455.15pt;height:41.4pt;z-index:251658240;visibility:visible;mso-wrap-style:square;mso-width-percent:0;mso-height-percent:0;mso-wrap-distance-left:9pt;mso-wrap-distance-top:3.6pt;mso-wrap-distance-right:9pt;mso-wrap-distance-bottom:3.6pt;mso-position-horizontal:absolute;mso-position-horizontal-relative:text;mso-position-vertical:absolute;mso-position-vertical-relative:text;mso-width-percent:0;mso-height-percent:0;mso-width-relative:margin;mso-height-relative:margin;v-text-anchor:top" o:gfxdata="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" stroked="f">
+            <v:shape id="Cuadro de texto 1" o:spid="_x0000_s1027" type="#_x0000_t202" style="position:absolute;left:0;text-align:left;margin-left:16.1pt;margin-top:.65pt;width:455.15pt;height:41.4pt;z-index:251658240;visibility:visible;mso-wrap-style:square;mso-width-percent:0;mso-height-percent:0;mso-wrap-distance-left:9pt;mso-wrap-distance-top:3.6pt;mso-wrap-distance-right:9pt;mso-wrap-distance-bottom:3.6pt;mso-position-horizontal:absolute;mso-position-horizontal-relative:text;mso-position-vertical:absolute;mso-position-vertical-relative:text;mso-width-percent:0;mso-height-percent:0;mso-width-relative:margin;mso-height-relative:margin;v-text-anchor:top" o:gfxdata="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" stroked="f">
               <v:textbox>
                 <w:txbxContent>
                   <w:p>
@@ -8421,7 +8224,7 @@
 </file>
 
 <file path=word/footnotes.xml><?xml version="1.0" encoding="utf-8"?>
-<w:footnotes xmlns:wpc="http://schemas.microsoft.com/office/word/2010/wordprocessingCanvas" xmlns:mc="http://schemas.openxmlformats.org/markup-compatibility/2006" xmlns:o="urn:schemas-microsoft-com:office:office" xmlns:r="http://schemas.openxmlformats.org/officeDocument/2006/relationships" xmlns:m="http://schemas.openxmlformats.org/officeDocument/2006/math" xmlns:v="urn:schemas-microsoft-com:vml" xmlns:wp14="http://schemas.microsoft.com/office/word/2010/wordprocessingDrawing" xmlns:wp="http://schemas.openxmlformats.org/drawingml/2006/wordprocessingDrawing" xmlns:w10="urn:schemas-microsoft-com:office:word" xmlns:w="http://schemas.openxmlformats.org/wordprocessingml/2006/main" xmlns:w14="http://schemas.microsoft.com/office/word/2010/wordml" xmlns:w15="http://schemas.microsoft.com/office/word/2012/wordml" xmlns:wpg="http://schemas.microsoft.com/office/word/2010/wordprocessingGroup" xmlns:wpi="http://schemas.microsoft.com/office/word/2010/wordprocessingInk" xmlns:wne="http://schemas.microsoft.com/office/word/2006/wordml" xmlns:wps="http://schemas.microsoft.com/office/word/2010/wordprocessingShape" mc:Ignorable="w14 w15 wp14">
+<w:footnotes xmlns:wpc="http://schemas.microsoft.com/office/word/2010/wordprocessingCanvas" xmlns:cx="http://schemas.microsoft.com/office/drawing/2014/chartex" xmlns:cx1="http://schemas.microsoft.com/office/drawing/2015/9/8/chartex" xmlns:cx2="http://schemas.microsoft.com/office/drawing/2015/10/21/chartex" xmlns:cx3="http://schemas.microsoft.com/office/drawing/2016/5/9/chartex" xmlns:cx4="http://schemas.microsoft.com/office/drawing/2016/5/10/chartex" xmlns:cx5="http://schemas.microsoft.com/office/drawing/2016/5/11/chartex" xmlns:cx6="http://schemas.microsoft.com/office/drawing/2016/5/12/chartex" xmlns:cx7="http://schemas.microsoft.com/office/drawing/2016/5/13/chartex" xmlns:cx8="http://schemas.microsoft.com/office/drawing/2016/5/14/chartex" xmlns:mc="http://schemas.openxmlformats.org/markup-compatibility/2006" xmlns:aink="http://schemas.microsoft.com/office/drawing/2016/ink" xmlns:am3d="http://schemas.microsoft.com/office/drawing/2017/model3d" xmlns:o="urn:schemas-microsoft-com:office:office" xmlns:oel="http://schemas.microsoft.com/office/2019/extlst" xmlns:r="http://schemas.openxmlformats.org/officeDocument/2006/relationships" xmlns:m="http://schemas.openxmlformats.org/officeDocument/2006/math" xmlns:v="urn:schemas-microsoft-com:vml" xmlns:wp14="http://schemas.microsoft.com/office/word/2010/wordprocessingDrawing" xmlns:wp="http://schemas.openxmlformats.org/drawingml/2006/wordprocessingDrawing" xmlns:w10="urn:schemas-microsoft-com:office:word" xmlns:w="http://schemas.openxmlformats.org/wordprocessingml/2006/main" xmlns:w14="http://schemas.microsoft.com/office/word/2010/wordml" xmlns:w15="http://schemas.microsoft.com/office/word/2012/wordml" xmlns:w16cex="http://schemas.microsoft.com/office/word/2018/wordml/cex" xmlns:w16cid="http://schemas.microsoft.com/office/word/2016/wordml/cid" xmlns:w16="http://schemas.microsoft.com/office/word/2018/wordml" xmlns:w16du="http://schemas.microsoft.com/office/word/2023/wordml/word16du" xmlns:w16sdtdh="http://schemas.microsoft.com/office/word/2020/wordml/sdtdatahash" xmlns:w16sdtfl="http://schemas.microsoft.com/office/word/2024/wordml/sdtformatlock" xmlns:w16se="http://schemas.microsoft.com/office/word/2015/wordml/symex" xmlns:wpg="http://schemas.microsoft.com/office/word/2010/wordprocessingGroup" xmlns:wpi="http://schemas.microsoft.com/office/word/2010/wordprocessingInk" xmlns:wne="http://schemas.microsoft.com/office/word/2006/wordml" xmlns:wps="http://schemas.microsoft.com/office/word/2010/wordprocessingShape" mc:Ignorable="w14 w15 w16se w16cid w16 w16cex w16sdtdh w16sdtfl w16du wp14">
   <w:footnote w:type="separator" w:id="-1">
     <w:p>
       <w:pPr>
@@ -8446,7 +8249,7 @@
 </file>
 
 <file path=word/header1.xml><?xml version="1.0" encoding="utf-8"?>
-<w:hdr xmlns:wpc="http://schemas.microsoft.com/office/word/2010/wordprocessingCanvas" xmlns:mc="http://schemas.openxmlformats.org/markup-compatibility/2006" xmlns:o="urn:schemas-microsoft-com:office:office" xmlns:r="http://schemas.openxmlformats.org/officeDocument/2006/relationships" xmlns:m="http://schemas.openxmlformats.org/officeDocument/2006/math" xmlns:v="urn:schemas-microsoft-com:vml" xmlns:wp14="http://schemas.microsoft.com/office/word/2010/wordprocessingDrawing" xmlns:wp="http://schemas.openxmlformats.org/drawingml/2006/wordprocessingDrawing" xmlns:w10="urn:schemas-microsoft-com:office:word" xmlns:w="http://schemas.openxmlformats.org/wordprocessingml/2006/main" xmlns:w14="http://schemas.microsoft.com/office/word/2010/wordml" xmlns:w15="http://schemas.microsoft.com/office/word/2012/wordml" xmlns:wpg="http://schemas.microsoft.com/office/word/2010/wordprocessingGroup" xmlns:wpi="http://schemas.microsoft.com/office/word/2010/wordprocessingInk" xmlns:wne="http://schemas.microsoft.com/office/word/2006/wordml" xmlns:wps="http://schemas.microsoft.com/office/word/2010/wordprocessingShape" mc:Ignorable="w14 w15 wp14">
+<w:hdr xmlns:wpc="http://schemas.microsoft.com/office/word/2010/wordprocessingCanvas" xmlns:cx="http://schemas.microsoft.com/office/drawing/2014/chartex" xmlns:cx1="http://schemas.microsoft.com/office/drawing/2015/9/8/chartex" xmlns:cx2="http://schemas.microsoft.com/office/drawing/2015/10/21/chartex" xmlns:cx3="http://schemas.microsoft.com/office/drawing/2016/5/9/chartex" xmlns:cx4="http://schemas.microsoft.com/office/drawing/2016/5/10/chartex" xmlns:cx5="http://schemas.microsoft.com/office/drawing/2016/5/11/chartex" xmlns:cx6="http://schemas.microsoft.com/office/drawing/2016/5/12/chartex" xmlns:cx7="http://schemas.microsoft.com/office/drawing/2016/5/13/chartex" xmlns:cx8="http://schemas.microsoft.com/office/drawing/2016/5/14/chartex" xmlns:mc="http://schemas.openxmlformats.org/markup-compatibility/2006" xmlns:aink="http://schemas.microsoft.com/office/drawing/2016/ink" xmlns:am3d="http://schemas.microsoft.com/office/drawing/2017/model3d" xmlns:o="urn:schemas-microsoft-com:office:office" xmlns:oel="http://schemas.microsoft.com/office/2019/extlst" xmlns:r="http://schemas.openxmlformats.org/officeDocument/2006/relationships" xmlns:m="http://schemas.openxmlformats.org/officeDocument/2006/math" xmlns:v="urn:schemas-microsoft-com:vml" xmlns:wp14="http://schemas.microsoft.com/office/word/2010/wordprocessingDrawing" xmlns:wp="http://schemas.openxmlformats.org/drawingml/2006/wordprocessingDrawing" xmlns:w10="urn:schemas-microsoft-com:office:word" xmlns:w="http://schemas.openxmlformats.org/wordprocessingml/2006/main" xmlns:w14="http://schemas.microsoft.com/office/word/2010/wordml" xmlns:w15="http://schemas.microsoft.com/office/word/2012/wordml" xmlns:w16cex="http://schemas.microsoft.com/office/word/2018/wordml/cex" xmlns:w16cid="http://schemas.microsoft.com/office/word/2016/wordml/cid" xmlns:w16="http://schemas.microsoft.com/office/word/2018/wordml" xmlns:w16du="http://schemas.microsoft.com/office/word/2023/wordml/word16du" xmlns:w16sdtdh="http://schemas.microsoft.com/office/word/2020/wordml/sdtdatahash" xmlns:w16sdtfl="http://schemas.microsoft.com/office/word/2024/wordml/sdtformatlock" xmlns:w16se="http://schemas.microsoft.com/office/word/2015/wordml/symex" xmlns:wpg="http://schemas.microsoft.com/office/word/2010/wordprocessingGroup" xmlns:wpi="http://schemas.microsoft.com/office/word/2010/wordprocessingInk" xmlns:wne="http://schemas.microsoft.com/office/word/2006/wordml" xmlns:wps="http://schemas.microsoft.com/office/word/2010/wordprocessingShape" mc:Ignorable="w14 w15 w16se w16cid w16 w16cex w16sdtdh w16sdtfl w16du wp14">
   <w:p>
     <w:pPr>
       <w:pStyle w:val="Encabezado"/>
@@ -8518,7 +8321,7 @@
 </file>
 
 <file path=word/numbering.xml><?xml version="1.0" encoding="utf-8"?>
-<w:numbering xmlns:wpc="http://schemas.microsoft.com/office/word/2010/wordprocessingCanvas" xmlns:mc="http://schemas.openxmlformats.org/markup-compatibility/2006" xmlns:o="urn:schemas-microsoft-com:office:office" xmlns:r="http://schemas.openxmlformats.org/officeDocument/2006/relationships" xmlns:m="http://schemas.openxmlformats.org/officeDocument/2006/math" xmlns:v="urn:schemas-microsoft-com:vml" xmlns:wp14="http://schemas.microsoft.com/office/word/2010/wordprocessingDrawing" xmlns:wp="http://schemas.openxmlformats.org/drawingml/2006/wordprocessingDrawing" xmlns:w10="urn:schemas-microsoft-com:office:word" xmlns:w="http://schemas.openxmlformats.org/wordprocessingml/2006/main" xmlns:w14="http://schemas.microsoft.com/office/word/2010/wordml" xmlns:w15="http://schemas.microsoft.com/office/word/2012/wordml" xmlns:wpg="http://schemas.microsoft.com/office/word/2010/wordprocessingGroup" xmlns:wpi="http://schemas.microsoft.com/office/word/2010/wordprocessingInk" xmlns:wne="http://schemas.microsoft.com/office/word/2006/wordml" xmlns:wps="http://schemas.microsoft.com/office/word/2010/wordprocessingShape" mc:Ignorable="w14 w15 wp14">
+<w:numbering xmlns:wpc="http://schemas.microsoft.com/office/word/2010/wordprocessingCanvas" xmlns:cx="http://schemas.microsoft.com/office/drawing/2014/chartex" xmlns:cx1="http://schemas.microsoft.com/office/drawing/2015/9/8/chartex" xmlns:cx2="http://schemas.microsoft.com/office/drawing/2015/10/21/chartex" xmlns:cx3="http://schemas.microsoft.com/office/drawing/2016/5/9/chartex" xmlns:cx4="http://schemas.microsoft.com/office/drawing/2016/5/10/chartex" xmlns:cx5="http://schemas.microsoft.com/office/drawing/2016/5/11/chartex" xmlns:cx6="http://schemas.microsoft.com/office/drawing/2016/5/12/chartex" xmlns:cx7="http://schemas.microsoft.com/office/drawing/2016/5/13/chartex" xmlns:cx8="http://schemas.microsoft.com/office/drawing/2016/5/14/chartex" xmlns:mc="http://schemas.openxmlformats.org/markup-compatibility/2006" xmlns:aink="http://schemas.microsoft.com/office/drawing/2016/ink" xmlns:am3d="http://schemas.microsoft.com/office/drawing/2017/model3d" xmlns:o="urn:schemas-microsoft-com:office:office" xmlns:oel="http://schemas.microsoft.com/office/2019/extlst" xmlns:r="http://schemas.openxmlformats.org/officeDocument/2006/relationships" xmlns:m="http://schemas.openxmlformats.org/officeDocument/2006/math" xmlns:v="urn:schemas-microsoft-com:vml" xmlns:wp14="http://schemas.microsoft.com/office/word/2010/wordprocessingDrawing" xmlns:wp="http://schemas.openxmlformats.org/drawingml/2006/wordprocessingDrawing" xmlns:w10="urn:schemas-microsoft-com:office:word" xmlns:w="http://schemas.openxmlformats.org/wordprocessingml/2006/main" xmlns:w14="http://schemas.microsoft.com/office/word/2010/wordml" xmlns:w15="http://schemas.microsoft.com/office/word/2012/wordml" xmlns:w16cex="http://schemas.microsoft.com/office/word/2018/wordml/cex" xmlns:w16cid="http://schemas.microsoft.com/office/word/2016/wordml/cid" xmlns:w16="http://schemas.microsoft.com/office/word/2018/wordml" xmlns:w16du="http://schemas.microsoft.com/office/word/2023/wordml/word16du" xmlns:w16sdtdh="http://schemas.microsoft.com/office/word/2020/wordml/sdtdatahash" xmlns:w16sdtfl="http://schemas.microsoft.com/office/word/2024/wordml/sdtformatlock" xmlns:w16se="http://schemas.microsoft.com/office/word/2015/wordml/symex" xmlns:wpg="http://schemas.microsoft.com/office/word/2010/wordprocessingGroup" xmlns:wpi="http://schemas.microsoft.com/office/word/2010/wordprocessingInk" xmlns:wne="http://schemas.microsoft.com/office/word/2006/wordml" xmlns:wps="http://schemas.microsoft.com/office/word/2010/wordprocessingShape" mc:Ignorable="w14 w15 w16se w16cid w16 w16cex w16sdtdh w16sdtfl w16du wp14">
   <w:abstractNum w:abstractNumId="0" w15:restartNumberingAfterBreak="0">
     <w:nsid w:val="FFFFFF89"/>
     <w:multiLevelType w:val="singleLevel"/>
@@ -10420,61 +10223,61 @@
       </w:rPr>
     </w:lvl>
   </w:abstractNum>
-  <w:num w:numId="1">
+  <w:num w:numId="1" w16cid:durableId="631205275">
     <w:abstractNumId w:val="16"/>
   </w:num>
-  <w:num w:numId="2">
+  <w:num w:numId="2" w16cid:durableId="797800249">
     <w:abstractNumId w:val="0"/>
   </w:num>
-  <w:num w:numId="3">
+  <w:num w:numId="3" w16cid:durableId="851601341">
     <w:abstractNumId w:val="10"/>
   </w:num>
-  <w:num w:numId="4">
+  <w:num w:numId="4" w16cid:durableId="1138111672">
     <w:abstractNumId w:val="5"/>
   </w:num>
-  <w:num w:numId="5">
+  <w:num w:numId="5" w16cid:durableId="1139419711">
     <w:abstractNumId w:val="15"/>
   </w:num>
-  <w:num w:numId="6">
+  <w:num w:numId="6" w16cid:durableId="1197424489">
     <w:abstractNumId w:val="14"/>
   </w:num>
-  <w:num w:numId="7">
+  <w:num w:numId="7" w16cid:durableId="753666020">
     <w:abstractNumId w:val="7"/>
   </w:num>
-  <w:num w:numId="8">
+  <w:num w:numId="8" w16cid:durableId="326137205">
     <w:abstractNumId w:val="9"/>
   </w:num>
-  <w:num w:numId="9">
+  <w:num w:numId="9" w16cid:durableId="310598079">
     <w:abstractNumId w:val="2"/>
   </w:num>
-  <w:num w:numId="10">
+  <w:num w:numId="10" w16cid:durableId="1827668111">
     <w:abstractNumId w:val="13"/>
   </w:num>
-  <w:num w:numId="11">
+  <w:num w:numId="11" w16cid:durableId="1024556589">
     <w:abstractNumId w:val="17"/>
   </w:num>
-  <w:num w:numId="12">
+  <w:num w:numId="12" w16cid:durableId="946081217">
     <w:abstractNumId w:val="12"/>
   </w:num>
-  <w:num w:numId="13">
+  <w:num w:numId="13" w16cid:durableId="2120176890">
     <w:abstractNumId w:val="6"/>
   </w:num>
-  <w:num w:numId="14">
+  <w:num w:numId="14" w16cid:durableId="2041084792">
     <w:abstractNumId w:val="4"/>
   </w:num>
-  <w:num w:numId="15">
+  <w:num w:numId="15" w16cid:durableId="523633310">
     <w:abstractNumId w:val="1"/>
   </w:num>
-  <w:num w:numId="16">
+  <w:num w:numId="16" w16cid:durableId="48237800">
     <w:abstractNumId w:val="18"/>
   </w:num>
-  <w:num w:numId="17">
+  <w:num w:numId="17" w16cid:durableId="995300353">
     <w:abstractNumId w:val="8"/>
   </w:num>
-  <w:num w:numId="18">
+  <w:num w:numId="18" w16cid:durableId="479348187">
     <w:abstractNumId w:val="3"/>
   </w:num>
-  <w:num w:numId="19">
+  <w:num w:numId="19" w16cid:durableId="1063063702">
     <w:abstractNumId w:val="11"/>
   </w:num>
   <w:numIdMacAtCleanup w:val="17"/>
@@ -10482,7 +10285,7 @@
 </file>
 
 <file path=word/styles.xml><?xml version="1.0" encoding="utf-8"?>
-<w:styles xmlns:mc="http://schemas.openxmlformats.org/markup-compatibility/2006" xmlns:r="http://schemas.openxmlformats.org/officeDocument/2006/relationships" xmlns:w="http://schemas.openxmlformats.org/wordprocessingml/2006/main" xmlns:w14="http://schemas.microsoft.com/office/word/2010/wordml" xmlns:w15="http://schemas.microsoft.com/office/word/2012/wordml" mc:Ignorable="w14 w15">
+<w:styles xmlns:mc="http://schemas.openxmlformats.org/markup-compatibility/2006" xmlns:r="http://schemas.openxmlformats.org/officeDocument/2006/relationships" xmlns:w="http://schemas.openxmlformats.org/wordprocessingml/2006/main" xmlns:w14="http://schemas.microsoft.com/office/word/2010/wordml" xmlns:w15="http://schemas.microsoft.com/office/word/2012/wordml" xmlns:w16cex="http://schemas.microsoft.com/office/word/2018/wordml/cex" xmlns:w16cid="http://schemas.microsoft.com/office/word/2016/wordml/cid" xmlns:w16="http://schemas.microsoft.com/office/word/2018/wordml" xmlns:w16du="http://schemas.microsoft.com/office/word/2023/wordml/word16du" xmlns:w16sdtdh="http://schemas.microsoft.com/office/word/2020/wordml/sdtdatahash" xmlns:w16sdtfl="http://schemas.microsoft.com/office/word/2024/wordml/sdtformatlock" xmlns:w16se="http://schemas.microsoft.com/office/word/2015/wordml/symex" mc:Ignorable="w14 w15 w16se w16cid w16 w16cex w16sdtdh w16sdtfl w16du">
   <w:docDefaults>
     <w:rPrDefault>
       <w:rPr>
@@ -10492,7 +10295,7 @@
     </w:rPrDefault>
     <w:pPrDefault/>
   </w:docDefaults>
-  <w:latentStyles w:defLockedState="0" w:defUIPriority="99" w:defSemiHidden="0" w:defUnhideWhenUsed="0" w:defQFormat="0" w:count="371">
+  <w:latentStyles w:defLockedState="0" w:defUIPriority="99" w:defSemiHidden="0" w:defUnhideWhenUsed="0" w:defQFormat="0" w:count="376">
     <w:lsdException w:name="Normal" w:uiPriority="0" w:qFormat="1"/>
     <w:lsdException w:name="heading 1" w:uiPriority="9" w:qFormat="1"/>
     <w:lsdException w:name="heading 2" w:semiHidden="1" w:uiPriority="9" w:unhideWhenUsed="1" w:qFormat="1"/>
@@ -10864,6 +10667,11 @@
     <w:lsdException w:name="List Table 5 Dark Accent 6" w:uiPriority="50"/>
     <w:lsdException w:name="List Table 6 Colorful Accent 6" w:uiPriority="51"/>
     <w:lsdException w:name="List Table 7 Colorful Accent 6" w:uiPriority="52"/>
+    <w:lsdException w:name="Mention" w:semiHidden="1" w:unhideWhenUsed="1"/>
+    <w:lsdException w:name="Smart Hyperlink" w:semiHidden="1" w:unhideWhenUsed="1"/>
+    <w:lsdException w:name="Hashtag" w:semiHidden="1" w:unhideWhenUsed="1"/>
+    <w:lsdException w:name="Unresolved Mention" w:semiHidden="1" w:unhideWhenUsed="1"/>
+    <w:lsdException w:name="Smart Link" w:semiHidden="1" w:unhideWhenUsed="1"/>
   </w:latentStyles>
   <w:style w:type="paragraph" w:default="1" w:styleId="Normal">
     <w:name w:val="Normal"/>
@@ -10882,7 +10690,7 @@
   </w:style>
   <w:style w:type="paragraph" w:styleId="Ttulo1">
     <w:name w:val="heading 1"/>
-    <w:basedOn w:val="Puesto"/>
+    <w:basedOn w:val="Ttulo"/>
     <w:next w:val="Normal"/>
     <w:link w:val="Ttulo1Car"/>
     <w:autoRedefine/>
@@ -11300,11 +11108,11 @@
       <w:szCs w:val="24"/>
     </w:rPr>
   </w:style>
-  <w:style w:type="paragraph" w:styleId="Puesto">
+  <w:style w:type="paragraph" w:styleId="Ttulo">
     <w:name w:val="Title"/>
     <w:basedOn w:val="Normal"/>
     <w:next w:val="Normal"/>
-    <w:link w:val="PuestoCar"/>
+    <w:link w:val="TtuloCar"/>
     <w:uiPriority w:val="10"/>
     <w:qFormat/>
     <w:rsid w:val="00590D20"/>
@@ -11320,10 +11128,10 @@
       <w:szCs w:val="56"/>
     </w:rPr>
   </w:style>
-  <w:style w:type="character" w:customStyle="1" w:styleId="PuestoCar">
-    <w:name w:val="Puesto Car"/>
+  <w:style w:type="character" w:customStyle="1" w:styleId="TtuloCar">
+    <w:name w:val="Título Car"/>
     <w:basedOn w:val="Fuentedeprrafopredeter"/>
-    <w:link w:val="Puesto"/>
+    <w:link w:val="Ttulo"/>
     <w:uiPriority w:val="10"/>
     <w:rsid w:val="00590D20"/>
     <w:rPr>
@@ -11580,10 +11388,15 @@
     <w:autoRedefine/>
     <w:uiPriority w:val="39"/>
     <w:unhideWhenUsed/>
-    <w:rsid w:val="000434FA"/>
+    <w:rsid w:val="00D21D86"/>
     <w:pPr>
+      <w:tabs>
+        <w:tab w:val="left" w:pos="1760"/>
+        <w:tab w:val="right" w:leader="dot" w:pos="9962"/>
+      </w:tabs>
       <w:spacing w:after="100"/>
-      <w:ind w:left="280"/>
+      <w:ind w:left="989" w:firstLine="0"/>
+      <w:jc w:val="both"/>
     </w:pPr>
   </w:style>
   <w:style w:type="paragraph" w:styleId="TDC3">
@@ -11599,7 +11412,7 @@
       <w:ind w:left="560"/>
     </w:pPr>
   </w:style>
-  <w:style w:type="paragraph" w:styleId="TtulodeTDC">
+  <w:style w:type="paragraph" w:styleId="TtuloTDC">
     <w:name w:val="TOC Heading"/>
     <w:basedOn w:val="Ttulo1"/>
     <w:next w:val="Normal"/>
@@ -11864,8 +11677,8 @@
       </w:tcPr>
     </w:tblStylePr>
   </w:style>
-  <w:style w:type="character" w:customStyle="1" w:styleId="UnresolvedMention">
-    <w:name w:val="Unresolved Mention"/>
+  <w:style w:type="character" w:customStyle="1" w:styleId="Mencinsinresolver2">
+    <w:name w:val="Mención sin resolver2"/>
     <w:basedOn w:val="Fuentedeprrafopredeter"/>
     <w:uiPriority w:val="99"/>
     <w:semiHidden/>
@@ -12185,17 +11998,19 @@
 </file>
 
 <file path=customXml/item1.xml><?xml version="1.0" encoding="utf-8"?>
-<p:properties xmlns:p="http://schemas.microsoft.com/office/2006/metadata/properties" xmlns:xsi="http://www.w3.org/2001/XMLSchema-instance" xmlns:pc="http://schemas.microsoft.com/office/infopath/2007/PartnerControls">
-  <documentManagement>
-    <TaxCatchAll xmlns="285d351f-f218-493a-825f-85a9dfbde315" xsi:nil="true"/>
-    <lcf76f155ced4ddcb4097134ff3c332f xmlns="55abea07-cd72-4a95-add0-1082a24cf9e9">
-      <Terms xmlns="http://schemas.microsoft.com/office/infopath/2007/PartnerControls"/>
-    </lcf76f155ced4ddcb4097134ff3c332f>
-  </documentManagement>
-</p:properties>
+<b:Sources xmlns:b="http://schemas.openxmlformats.org/officeDocument/2006/bibliography" xmlns="http://schemas.openxmlformats.org/officeDocument/2006/bibliography" SelectedStyle="\APASixthEditionOfficeOnline.xsl" StyleName="APA" Version="6"/>
 </file>
 
 <file path=customXml/item2.xml><?xml version="1.0" encoding="utf-8"?>
+<?mso-contentType ?>
+<FormTemplates xmlns="http://schemas.microsoft.com/sharepoint/v3/contenttype/forms">
+  <Display>DocumentLibraryForm</Display>
+  <Edit>DocumentLibraryForm</Edit>
+  <New>DocumentLibraryForm</New>
+</FormTemplates>
+</file>
+
+<file path=customXml/item3.xml><?xml version="1.0" encoding="utf-8"?>
 <ct:contentTypeSchema xmlns:ct="http://schemas.microsoft.com/office/2006/metadata/contentType" xmlns:ma="http://schemas.microsoft.com/office/2006/metadata/properties/metaAttributes" ct:_="" ma:_="" ma:contentTypeName="Documento" ma:contentTypeID="0x0101005D7421CBAB376F47AC1876466873BE0C" ma:contentTypeVersion="11" ma:contentTypeDescription="Crear nuevo documento." ma:contentTypeScope="" ma:versionID="f360f8b6fb6f4c8bd21c6a7e407e2e16">
   <xsd:schema xmlns:xsd="http://www.w3.org/2001/XMLSchema" xmlns:xs="http://www.w3.org/2001/XMLSchema" xmlns:p="http://schemas.microsoft.com/office/2006/metadata/properties" xmlns:ns2="55abea07-cd72-4a95-add0-1082a24cf9e9" xmlns:ns3="285d351f-f218-493a-825f-85a9dfbde315" targetNamespace="http://schemas.microsoft.com/office/2006/metadata/properties" ma:root="true" ma:fieldsID="45e32b76c8e436055369618aac27ad35" ns2:_="" ns3:_="">
     <xsd:import namespace="55abea07-cd72-4a95-add0-1082a24cf9e9"/>
@@ -12390,35 +12205,26 @@
 </ct:contentTypeSchema>
 </file>
 
-<file path=customXml/item3.xml><?xml version="1.0" encoding="utf-8"?>
-<?mso-contentType ?>
-<FormTemplates xmlns="http://schemas.microsoft.com/sharepoint/v3/contenttype/forms">
-  <Display>DocumentLibraryForm</Display>
-  <Edit>DocumentLibraryForm</Edit>
-  <New>DocumentLibraryForm</New>
-</FormTemplates>
-</file>
-
 <file path=customXml/item4.xml><?xml version="1.0" encoding="utf-8"?>
-<b:Sources xmlns:b="http://schemas.openxmlformats.org/officeDocument/2006/bibliography" xmlns="http://schemas.openxmlformats.org/officeDocument/2006/bibliography" SelectedStyle="\APASixthEditionOfficeOnline.xsl" StyleName="APA" Version="6"/>
+<p:properties xmlns:p="http://schemas.microsoft.com/office/2006/metadata/properties" xmlns:xsi="http://www.w3.org/2001/XMLSchema-instance" xmlns:pc="http://schemas.microsoft.com/office/infopath/2007/PartnerControls">
+  <documentManagement>
+    <TaxCatchAll xmlns="285d351f-f218-493a-825f-85a9dfbde315" xsi:nil="true"/>
+    <lcf76f155ced4ddcb4097134ff3c332f xmlns="55abea07-cd72-4a95-add0-1082a24cf9e9">
+      <Terms xmlns="http://schemas.microsoft.com/office/infopath/2007/PartnerControls"/>
+    </lcf76f155ced4ddcb4097134ff3c332f>
+  </documentManagement>
+</p:properties>
 </file>
 
 <file path=customXml/itemProps1.xml><?xml version="1.0" encoding="utf-8"?>
-<ds:datastoreItem xmlns:ds="http://schemas.openxmlformats.org/officeDocument/2006/customXml" ds:itemID="{CEECB56F-E1D8-45BF-A0A3-B5258E7263D4}">
+<ds:datastoreItem xmlns:ds="http://schemas.openxmlformats.org/officeDocument/2006/customXml" ds:itemID="{278AF5E2-B50F-4A75-A72C-91617034AC7A}">
   <ds:schemaRefs>
-    <ds:schemaRef ds:uri="http://schemas.microsoft.com/office/2006/metadata/properties"/>
-    <ds:schemaRef ds:uri="http://schemas.microsoft.com/office/infopath/2007/PartnerControls"/>
-    <ds:schemaRef ds:uri="2c0ff4f8-6664-4eb8-8bb0-965f2536cb1b"/>
-    <ds:schemaRef ds:uri="2b6b437a-5846-4934-ac66-7de06297595b"/>
+    <ds:schemaRef ds:uri="http://schemas.openxmlformats.org/officeDocument/2006/bibliography"/>
   </ds:schemaRefs>
 </ds:datastoreItem>
 </file>
 
 <file path=customXml/itemProps2.xml><?xml version="1.0" encoding="utf-8"?>
-<ds:datastoreItem xmlns:ds="http://schemas.openxmlformats.org/officeDocument/2006/customXml" ds:itemID="{90C2CD9F-4C19-4BD0-8741-FFAE32082EC3}"/>
-</file>
-
-<file path=customXml/itemProps3.xml><?xml version="1.0" encoding="utf-8"?>
 <ds:datastoreItem xmlns:ds="http://schemas.openxmlformats.org/officeDocument/2006/customXml" ds:itemID="{91756AAB-0645-4FFC-990B-34BB6096B23B}">
   <ds:schemaRefs>
     <ds:schemaRef ds:uri="http://schemas.microsoft.com/sharepoint/v3/contenttype/forms"/>
@@ -12426,10 +12232,32 @@
 </ds:datastoreItem>
 </file>
 
+<file path=customXml/itemProps3.xml><?xml version="1.0" encoding="utf-8"?>
+<ds:datastoreItem xmlns:ds="http://schemas.openxmlformats.org/officeDocument/2006/customXml" ds:itemID="{90C2CD9F-4C19-4BD0-8741-FFAE32082EC3}">
+  <ds:schemaRefs>
+    <ds:schemaRef ds:uri="http://schemas.microsoft.com/office/2006/metadata/contentType"/>
+    <ds:schemaRef ds:uri="http://schemas.microsoft.com/office/2006/metadata/properties/metaAttributes"/>
+    <ds:schemaRef ds:uri="http://www.w3.org/2001/XMLSchema"/>
+    <ds:schemaRef ds:uri="http://schemas.microsoft.com/office/2006/metadata/properties"/>
+    <ds:schemaRef ds:uri="55abea07-cd72-4a95-add0-1082a24cf9e9"/>
+    <ds:schemaRef ds:uri="285d351f-f218-493a-825f-85a9dfbde315"/>
+    <ds:schemaRef ds:uri="http://schemas.microsoft.com/office/2006/documentManagement/types"/>
+    <ds:schemaRef ds:uri="http://schemas.microsoft.com/office/infopath/2007/PartnerControls"/>
+    <ds:schemaRef ds:uri="http://schemas.openxmlformats.org/package/2006/metadata/core-properties"/>
+    <ds:schemaRef ds:uri="http://purl.org/dc/elements/1.1/"/>
+    <ds:schemaRef ds:uri="http://purl.org/dc/terms/"/>
+    <ds:schemaRef ds:uri="http://schemas.microsoft.com/internal/obd"/>
+  </ds:schemaRefs>
+</ds:datastoreItem>
+</file>
+
 <file path=customXml/itemProps4.xml><?xml version="1.0" encoding="utf-8"?>
-<ds:datastoreItem xmlns:ds="http://schemas.openxmlformats.org/officeDocument/2006/customXml" ds:itemID="{278AF5E2-B50F-4A75-A72C-91617034AC7A}">
+<ds:datastoreItem xmlns:ds="http://schemas.openxmlformats.org/officeDocument/2006/customXml" ds:itemID="{CEECB56F-E1D8-45BF-A0A3-B5258E7263D4}">
   <ds:schemaRefs>
-    <ds:schemaRef ds:uri="http://schemas.openxmlformats.org/officeDocument/2006/bibliography"/>
+    <ds:schemaRef ds:uri="http://schemas.microsoft.com/office/2006/metadata/properties"/>
+    <ds:schemaRef ds:uri="http://schemas.microsoft.com/office/infopath/2007/PartnerControls"/>
+    <ds:schemaRef ds:uri="285d351f-f218-493a-825f-85a9dfbde315"/>
+    <ds:schemaRef ds:uri="55abea07-cd72-4a95-add0-1082a24cf9e9"/>
   </ds:schemaRefs>
 </ds:datastoreItem>
 </file>
</xml_diff>

<commit_message>
[UPD] CFA + Fuentes
</commit_message>
<xml_diff>
--- a/fuentes/CF2_22230062_DU.docx
+++ b/fuentes/CF2_22230062_DU.docx
@@ -213,7 +213,7 @@
               </wp:anchor>
             </w:drawing>
           </mc:Choice>
-          <mc:Fallback xmlns:w16sdtfl="http://schemas.microsoft.com/office/word/2024/wordml/sdtformatlock" xmlns:w16du="http://schemas.microsoft.com/office/word/2023/wordml/word16du" xmlns:oel="http://schemas.microsoft.com/office/2019/extlst">
+          <mc:Fallback xmlns:oel="http://schemas.microsoft.com/office/2019/extlst" xmlns:w16du="http://schemas.microsoft.com/office/word/2023/wordml/word16du" xmlns:w16sdtfl="http://schemas.microsoft.com/office/word/2024/wordml/sdtformatlock">
             <w:pict>
               <v:rect w14:anchorId="18DC7DF1" id="Rectángulo 4" o:spid="_x0000_s1026" style="position:absolute;margin-left:-55.7pt;margin-top:29pt;width:613.85pt;height:204pt;z-index:-251659776;visibility:visible;mso-wrap-style:square;mso-width-percent:0;mso-height-percent:0;mso-wrap-distance-left:9pt;mso-wrap-distance-top:0;mso-wrap-distance-right:9pt;mso-wrap-distance-bottom:0;mso-position-horizontal:absolute;mso-position-horizontal-relative:text;mso-position-vertical:absolute;mso-position-vertical-relative:text;mso-width-percent:0;mso-height-percent:0;mso-width-relative:page;mso-height-relative:margin;v-text-anchor:middle" o:gfxdata="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" fillcolor="#00314d" stroked="f" strokeweight="1pt">
                 <v:path arrowok="t"/>
@@ -322,7 +322,7 @@
               </wp:anchor>
             </w:drawing>
           </mc:Choice>
-          <mc:Fallback xmlns:w16sdtfl="http://schemas.microsoft.com/office/word/2024/wordml/sdtformatlock" xmlns:w16du="http://schemas.microsoft.com/office/word/2023/wordml/word16du" xmlns:oel="http://schemas.microsoft.com/office/2019/extlst">
+          <mc:Fallback>
             <w:pict>
               <v:shapetype w14:anchorId="5E459EE6" id="_x0000_t202" coordsize="21600,21600" o:spt="202" path="m,l,21600r21600,l21600,xe">
                 <v:stroke joinstyle="miter"/>
@@ -1457,10 +1457,16 @@
           <w:noProof/>
         </w:rPr>
         <w:drawing>
-          <wp:inline distT="0" distB="0" distL="0" distR="0" wp14:anchorId="5DCB5179" wp14:editId="0938E77B">
+          <wp:inline distT="0" distB="0" distL="0" distR="0" wp14:anchorId="5DCB5179" wp14:editId="3D975E23">
             <wp:extent cx="4583495" cy="2578100"/>
             <wp:effectExtent l="0" t="0" r="7620" b="0"/>
-            <wp:docPr id="1083652026" name="Imagen 4"/>
+            <wp:docPr id="1083652026" name="Imagen 4">
+              <a:extLst xmlns:a="http://schemas.openxmlformats.org/drawingml/2006/main">
+                <a:ext uri="{C183D7F6-B498-43B3-948B-1728B52AA6E4}">
+                  <adec:decorative xmlns:adec="http://schemas.microsoft.com/office/drawing/2017/decorative" val="1"/>
+                </a:ext>
+              </a:extLst>
+            </wp:docPr>
             <wp:cNvGraphicFramePr>
               <a:graphicFrameLocks xmlns:a="http://schemas.openxmlformats.org/drawingml/2006/main" noChangeAspect="1"/>
             </wp:cNvGraphicFramePr>
@@ -1468,7 +1474,13 @@
               <a:graphicData uri="http://schemas.openxmlformats.org/drawingml/2006/picture">
                 <pic:pic xmlns:pic="http://schemas.openxmlformats.org/drawingml/2006/picture">
                   <pic:nvPicPr>
-                    <pic:cNvPr id="0" name="Picture 1"/>
+                    <pic:cNvPr id="1083652026" name="Imagen 4">
+                      <a:extLst>
+                        <a:ext uri="{C183D7F6-B498-43B3-948B-1728B52AA6E4}">
+                          <adec:decorative xmlns:adec="http://schemas.microsoft.com/office/drawing/2017/decorative" val="1"/>
+                        </a:ext>
+                      </a:extLst>
+                    </pic:cNvPr>
                     <pic:cNvPicPr>
                       <a:picLocks noChangeAspect="1" noChangeArrowheads="1"/>
                     </pic:cNvPicPr>
@@ -8158,7 +8170,7 @@
             </wp:anchor>
           </w:drawing>
         </mc:Choice>
-        <mc:Fallback xmlns:w16sdtfl="http://schemas.microsoft.com/office/word/2024/wordml/sdtformatlock" xmlns:w16du="http://schemas.microsoft.com/office/word/2023/wordml/word16du" xmlns:oel="http://schemas.microsoft.com/office/2019/extlst">
+        <mc:Fallback>
           <w:pict>
             <v:shapetype w14:anchorId="30EDB3B0" id="_x0000_t202" coordsize="21600,21600" o:spt="202" path="m,l,21600r21600,l21600,xe">
               <v:stroke joinstyle="miter"/>
@@ -11987,6 +11999,17 @@
 </file>
 
 <file path=customXml/item1.xml><?xml version="1.0" encoding="utf-8"?>
+<p:properties xmlns:p="http://schemas.microsoft.com/office/2006/metadata/properties" xmlns:xsi="http://www.w3.org/2001/XMLSchema-instance" xmlns:pc="http://schemas.microsoft.com/office/infopath/2007/PartnerControls">
+  <documentManagement>
+    <TaxCatchAll xmlns="285d351f-f218-493a-825f-85a9dfbde315" xsi:nil="true"/>
+    <lcf76f155ced4ddcb4097134ff3c332f xmlns="55abea07-cd72-4a95-add0-1082a24cf9e9">
+      <Terms xmlns="http://schemas.microsoft.com/office/infopath/2007/PartnerControls"/>
+    </lcf76f155ced4ddcb4097134ff3c332f>
+  </documentManagement>
+</p:properties>
+</file>
+
+<file path=customXml/item2.xml><?xml version="1.0" encoding="utf-8"?>
 <ct:contentTypeSchema xmlns:ct="http://schemas.microsoft.com/office/2006/metadata/contentType" xmlns:ma="http://schemas.microsoft.com/office/2006/metadata/properties/metaAttributes" ct:_="" ma:_="" ma:contentTypeName="Documento" ma:contentTypeID="0x0101005D7421CBAB376F47AC1876466873BE0C" ma:contentTypeVersion="11" ma:contentTypeDescription="Crear nuevo documento." ma:contentTypeScope="" ma:versionID="f360f8b6fb6f4c8bd21c6a7e407e2e16">
   <xsd:schema xmlns:xsd="http://www.w3.org/2001/XMLSchema" xmlns:xs="http://www.w3.org/2001/XMLSchema" xmlns:p="http://schemas.microsoft.com/office/2006/metadata/properties" xmlns:ns2="55abea07-cd72-4a95-add0-1082a24cf9e9" xmlns:ns3="285d351f-f218-493a-825f-85a9dfbde315" targetNamespace="http://schemas.microsoft.com/office/2006/metadata/properties" ma:root="true" ma:fieldsID="45e32b76c8e436055369618aac27ad35" ns2:_="" ns3:_="">
     <xsd:import namespace="55abea07-cd72-4a95-add0-1082a24cf9e9"/>
@@ -12181,22 +12204,7 @@
 </ct:contentTypeSchema>
 </file>
 
-<file path=customXml/item2.xml><?xml version="1.0" encoding="utf-8"?>
-<p:properties xmlns:p="http://schemas.microsoft.com/office/2006/metadata/properties" xmlns:xsi="http://www.w3.org/2001/XMLSchema-instance" xmlns:pc="http://schemas.microsoft.com/office/infopath/2007/PartnerControls">
-  <documentManagement>
-    <TaxCatchAll xmlns="285d351f-f218-493a-825f-85a9dfbde315" xsi:nil="true"/>
-    <lcf76f155ced4ddcb4097134ff3c332f xmlns="55abea07-cd72-4a95-add0-1082a24cf9e9">
-      <Terms xmlns="http://schemas.microsoft.com/office/infopath/2007/PartnerControls"/>
-    </lcf76f155ced4ddcb4097134ff3c332f>
-  </documentManagement>
-</p:properties>
-</file>
-
 <file path=customXml/item3.xml><?xml version="1.0" encoding="utf-8"?>
-<b:Sources xmlns:b="http://schemas.openxmlformats.org/officeDocument/2006/bibliography" xmlns="http://schemas.openxmlformats.org/officeDocument/2006/bibliography" SelectedStyle="\APASixthEditionOfficeOnline.xsl" StyleName="APA" Version="6"/>
-</file>
-
-<file path=customXml/item4.xml><?xml version="1.0" encoding="utf-8"?>
 <?mso-contentType ?>
 <FormTemplates xmlns="http://schemas.microsoft.com/sharepoint/v3/contenttype/forms">
   <Display>DocumentLibraryForm</Display>
@@ -12205,7 +12213,22 @@
 </FormTemplates>
 </file>
 
+<file path=customXml/item4.xml><?xml version="1.0" encoding="utf-8"?>
+<b:Sources xmlns:b="http://schemas.openxmlformats.org/officeDocument/2006/bibliography" xmlns="http://schemas.openxmlformats.org/officeDocument/2006/bibliography" SelectedStyle="\APASixthEditionOfficeOnline.xsl" StyleName="APA" Version="6"/>
+</file>
+
 <file path=customXml/itemProps1.xml><?xml version="1.0" encoding="utf-8"?>
+<ds:datastoreItem xmlns:ds="http://schemas.openxmlformats.org/officeDocument/2006/customXml" ds:itemID="{CEECB56F-E1D8-45BF-A0A3-B5258E7263D4}">
+  <ds:schemaRefs>
+    <ds:schemaRef ds:uri="http://schemas.microsoft.com/office/2006/metadata/properties"/>
+    <ds:schemaRef ds:uri="http://schemas.microsoft.com/office/infopath/2007/PartnerControls"/>
+    <ds:schemaRef ds:uri="285d351f-f218-493a-825f-85a9dfbde315"/>
+    <ds:schemaRef ds:uri="55abea07-cd72-4a95-add0-1082a24cf9e9"/>
+  </ds:schemaRefs>
+</ds:datastoreItem>
+</file>
+
+<file path=customXml/itemProps2.xml><?xml version="1.0" encoding="utf-8"?>
 <ds:datastoreItem xmlns:ds="http://schemas.openxmlformats.org/officeDocument/2006/customXml" ds:itemID="{90C2CD9F-4C19-4BD0-8741-FFAE32082EC3}">
   <ds:schemaRefs>
     <ds:schemaRef ds:uri="http://schemas.microsoft.com/office/2006/metadata/contentType"/>
@@ -12224,29 +12247,18 @@
 </ds:datastoreItem>
 </file>
 
-<file path=customXml/itemProps2.xml><?xml version="1.0" encoding="utf-8"?>
-<ds:datastoreItem xmlns:ds="http://schemas.openxmlformats.org/officeDocument/2006/customXml" ds:itemID="{CEECB56F-E1D8-45BF-A0A3-B5258E7263D4}">
+<file path=customXml/itemProps3.xml><?xml version="1.0" encoding="utf-8"?>
+<ds:datastoreItem xmlns:ds="http://schemas.openxmlformats.org/officeDocument/2006/customXml" ds:itemID="{91756AAB-0645-4FFC-990B-34BB6096B23B}">
   <ds:schemaRefs>
-    <ds:schemaRef ds:uri="http://schemas.microsoft.com/office/2006/metadata/properties"/>
-    <ds:schemaRef ds:uri="http://schemas.microsoft.com/office/infopath/2007/PartnerControls"/>
-    <ds:schemaRef ds:uri="285d351f-f218-493a-825f-85a9dfbde315"/>
-    <ds:schemaRef ds:uri="55abea07-cd72-4a95-add0-1082a24cf9e9"/>
+    <ds:schemaRef ds:uri="http://schemas.microsoft.com/sharepoint/v3/contenttype/forms"/>
   </ds:schemaRefs>
 </ds:datastoreItem>
 </file>
 
-<file path=customXml/itemProps3.xml><?xml version="1.0" encoding="utf-8"?>
+<file path=customXml/itemProps4.xml><?xml version="1.0" encoding="utf-8"?>
 <ds:datastoreItem xmlns:ds="http://schemas.openxmlformats.org/officeDocument/2006/customXml" ds:itemID="{278AF5E2-B50F-4A75-A72C-91617034AC7A}">
   <ds:schemaRefs>
     <ds:schemaRef ds:uri="http://schemas.openxmlformats.org/officeDocument/2006/bibliography"/>
   </ds:schemaRefs>
 </ds:datastoreItem>
-</file>
-
-<file path=customXml/itemProps4.xml><?xml version="1.0" encoding="utf-8"?>
-<ds:datastoreItem xmlns:ds="http://schemas.openxmlformats.org/officeDocument/2006/customXml" ds:itemID="{91756AAB-0645-4FFC-990B-34BB6096B23B}">
-  <ds:schemaRefs>
-    <ds:schemaRef ds:uri="http://schemas.microsoft.com/sharepoint/v3/contenttype/forms"/>
-  </ds:schemaRefs>
-</ds:datastoreItem>
 </file>
</xml_diff>

<commit_message>
[UPD] CFA Word + PDF
</commit_message>
<xml_diff>
--- a/fuentes/CF2_22230062_DU.docx
+++ b/fuentes/CF2_22230062_DU.docx
@@ -6328,19 +6328,20 @@
         <w:rPr>
           <w:lang w:eastAsia="es-CO"/>
         </w:rPr>
-        <w:tab/>
-      </w:r>
-      <w:r>
-        <w:rPr>
-          <w:lang w:eastAsia="es-CO"/>
-        </w:rPr>
-        <w:tab/>
-      </w:r>
-    </w:p>
-    <w:p>
-      <w:pPr>
-        <w:ind w:firstLine="284"/>
-        <w:rPr>
+        <w:t>GEI, energías renovables, evaluación del ciclo de vida y participación comunitaria.</w:t>
+      </w:r>
+      <w:r>
+        <w:rPr>
+          <w:lang w:eastAsia="es-CO"/>
+        </w:rPr>
+        <w:tab/>
+      </w:r>
+    </w:p>
+    <w:p>
+      <w:pPr>
+        <w:ind w:firstLine="0"/>
+        <w:rPr>
+          <w:noProof/>
           <w:lang w:eastAsia="es-CO"/>
         </w:rPr>
       </w:pPr>
@@ -6351,10 +6352,10 @@
         </w:rPr>
         <w:lastRenderedPageBreak/>
         <w:drawing>
-          <wp:inline distT="0" distB="0" distL="0" distR="0" wp14:anchorId="0A1A9803" wp14:editId="30A6946E">
-            <wp:extent cx="6184423" cy="4814335"/>
-            <wp:effectExtent l="0" t="0" r="0" b="5715"/>
-            <wp:docPr id="1804445441" name="Imagen 5" descr="Se presentan etapas del análisis de viabilidad, eficiencia y evaluación de impactos en procesos energéticos, con recuadros y flechas que describen aspectos como eficiencia energética, viabilidad económica, reducción de GEI, energías renovables, evaluación del ciclo de vida y participación comunitaria."/>
+          <wp:inline distT="0" distB="0" distL="0" distR="0" wp14:anchorId="0B488A3F" wp14:editId="575C6283">
+            <wp:extent cx="6332220" cy="4929505"/>
+            <wp:effectExtent l="0" t="0" r="0" b="4445"/>
+            <wp:docPr id="7" name="Gráfico 7" descr="GEI, energías renovables, evaluación del ciclo de vida y participación comunitaria. "/>
             <wp:cNvGraphicFramePr>
               <a:graphicFrameLocks xmlns:a="http://schemas.openxmlformats.org/drawingml/2006/main" noChangeAspect="1"/>
             </wp:cNvGraphicFramePr>
@@ -6362,10 +6363,8 @@
               <a:graphicData uri="http://schemas.openxmlformats.org/drawingml/2006/picture">
                 <pic:pic xmlns:pic="http://schemas.openxmlformats.org/drawingml/2006/picture">
                   <pic:nvPicPr>
-                    <pic:cNvPr id="1804445441" name="Imagen 5" descr="Se presentan etapas del análisis de viabilidad, eficiencia y evaluación de impactos en procesos energéticos, con recuadros y flechas que describen aspectos como eficiencia energética, viabilidad económica, reducción de GEI, energías renovables, evaluación del ciclo de vida y participación comunitaria."/>
-                    <pic:cNvPicPr>
-                      <a:picLocks noChangeAspect="1" noChangeArrowheads="1"/>
-                    </pic:cNvPicPr>
+                    <pic:cNvPr id="7" name="Gráfico 7" descr="GEI, energías renovables, evaluación del ciclo de vida y participación comunitaria. "/>
+                    <pic:cNvPicPr/>
                   </pic:nvPicPr>
                   <pic:blipFill>
                     <a:blip r:embed="rId13">
@@ -6373,22 +6372,23 @@
                         <a:ext uri="{28A0092B-C50C-407E-A947-70E740481C1C}">
                           <a14:useLocalDpi xmlns:a14="http://schemas.microsoft.com/office/drawing/2010/main" val="0"/>
                         </a:ext>
+                        <a:ext uri="{96DAC541-7B7A-43D3-8B79-37D633B846F1}">
+                          <asvg:svgBlip xmlns:asvg="http://schemas.microsoft.com/office/drawing/2016/SVG/main" r:embed="rId14"/>
+                        </a:ext>
                       </a:extLst>
                     </a:blip>
-                    <a:srcRect/>
                     <a:stretch>
                       <a:fillRect/>
                     </a:stretch>
                   </pic:blipFill>
-                  <pic:spPr bwMode="auto">
+                  <pic:spPr>
                     <a:xfrm>
                       <a:off x="0" y="0"/>
-                      <a:ext cx="6196574" cy="4823794"/>
+                      <a:ext cx="6332220" cy="4929505"/>
                     </a:xfrm>
                     <a:prstGeom prst="rect">
                       <a:avLst/>
                     </a:prstGeom>
-                    <a:noFill/>
                   </pic:spPr>
                 </pic:pic>
               </a:graphicData>
@@ -6396,6 +6396,14 @@
           </wp:inline>
         </w:drawing>
       </w:r>
+    </w:p>
+    <w:p>
+      <w:pPr>
+        <w:ind w:firstLine="284"/>
+        <w:rPr>
+          <w:lang w:eastAsia="es-CO"/>
+        </w:rPr>
+      </w:pPr>
       <w:r>
         <w:rPr>
           <w:lang w:eastAsia="es-CO"/>
@@ -7180,14 +7188,14 @@
         <w:rPr>
           <w:lang w:val="es-MX" w:eastAsia="es-CO"/>
         </w:rPr>
-        <w:t xml:space="preserve">UNEP, GRID-Arendal. (2018). Energy and </w:t>
+        <w:t xml:space="preserve">UNEP, GRID-Arendal. (2018). Energy and the </w:t>
       </w:r>
       <w:proofErr w:type="spellStart"/>
       <w:r>
         <w:rPr>
           <w:lang w:val="es-MX" w:eastAsia="es-CO"/>
         </w:rPr>
-        <w:t>the</w:t>
+        <w:t>Sustainable</w:t>
       </w:r>
       <w:proofErr w:type="spellEnd"/>
       <w:r>
@@ -7201,7 +7209,7 @@
         <w:rPr>
           <w:lang w:val="es-MX" w:eastAsia="es-CO"/>
         </w:rPr>
-        <w:t>Sustainable</w:t>
+        <w:t>Development</w:t>
       </w:r>
       <w:proofErr w:type="spellEnd"/>
       <w:r>
@@ -7215,42 +7223,14 @@
         <w:rPr>
           <w:lang w:val="es-MX" w:eastAsia="es-CO"/>
         </w:rPr>
-        <w:t>Development</w:t>
+        <w:t>Goals</w:t>
       </w:r>
       <w:proofErr w:type="spellEnd"/>
       <w:r>
         <w:rPr>
           <w:lang w:val="es-MX" w:eastAsia="es-CO"/>
         </w:rPr>
-        <w:t xml:space="preserve"> </w:t>
-      </w:r>
-      <w:proofErr w:type="spellStart"/>
-      <w:r>
-        <w:rPr>
-          <w:lang w:val="es-MX" w:eastAsia="es-CO"/>
-        </w:rPr>
-        <w:t>Goals</w:t>
-      </w:r>
-      <w:proofErr w:type="spellEnd"/>
-      <w:r>
-        <w:rPr>
-          <w:lang w:val="es-MX" w:eastAsia="es-CO"/>
-        </w:rPr>
-        <w:t xml:space="preserve">: </w:t>
-      </w:r>
-      <w:proofErr w:type="spellStart"/>
-      <w:r>
-        <w:rPr>
-          <w:lang w:val="es-MX" w:eastAsia="es-CO"/>
-        </w:rPr>
-        <w:t>An</w:t>
-      </w:r>
-      <w:proofErr w:type="spellEnd"/>
-      <w:r>
-        <w:rPr>
-          <w:lang w:val="es-MX" w:eastAsia="es-CO"/>
-        </w:rPr>
-        <w:t xml:space="preserve"> </w:t>
+        <w:t xml:space="preserve">: An </w:t>
       </w:r>
       <w:proofErr w:type="spellStart"/>
       <w:r>
@@ -8050,8 +8030,8 @@
       </w:pPr>
     </w:p>
     <w:sectPr>
-      <w:headerReference w:type="default" r:id="rId14"/>
-      <w:footerReference w:type="default" r:id="rId15"/>
+      <w:headerReference w:type="default" r:id="rId15"/>
+      <w:footerReference w:type="default" r:id="rId16"/>
       <w:pgSz w:w="12240" w:h="15840"/>
       <w:pgMar w:top="1701" w:right="1134" w:bottom="1134" w:left="1134" w:header="709" w:footer="737" w:gutter="0"/>
       <w:pgNumType w:start="1"/>
@@ -11999,17 +11979,6 @@
 </file>
 
 <file path=customXml/item1.xml><?xml version="1.0" encoding="utf-8"?>
-<p:properties xmlns:p="http://schemas.microsoft.com/office/2006/metadata/properties" xmlns:xsi="http://www.w3.org/2001/XMLSchema-instance" xmlns:pc="http://schemas.microsoft.com/office/infopath/2007/PartnerControls">
-  <documentManagement>
-    <TaxCatchAll xmlns="285d351f-f218-493a-825f-85a9dfbde315" xsi:nil="true"/>
-    <lcf76f155ced4ddcb4097134ff3c332f xmlns="55abea07-cd72-4a95-add0-1082a24cf9e9">
-      <Terms xmlns="http://schemas.microsoft.com/office/infopath/2007/PartnerControls"/>
-    </lcf76f155ced4ddcb4097134ff3c332f>
-  </documentManagement>
-</p:properties>
-</file>
-
-<file path=customXml/item2.xml><?xml version="1.0" encoding="utf-8"?>
 <ct:contentTypeSchema xmlns:ct="http://schemas.microsoft.com/office/2006/metadata/contentType" xmlns:ma="http://schemas.microsoft.com/office/2006/metadata/properties/metaAttributes" ct:_="" ma:_="" ma:contentTypeName="Documento" ma:contentTypeID="0x0101005D7421CBAB376F47AC1876466873BE0C" ma:contentTypeVersion="11" ma:contentTypeDescription="Crear nuevo documento." ma:contentTypeScope="" ma:versionID="f360f8b6fb6f4c8bd21c6a7e407e2e16">
   <xsd:schema xmlns:xsd="http://www.w3.org/2001/XMLSchema" xmlns:xs="http://www.w3.org/2001/XMLSchema" xmlns:p="http://schemas.microsoft.com/office/2006/metadata/properties" xmlns:ns2="55abea07-cd72-4a95-add0-1082a24cf9e9" xmlns:ns3="285d351f-f218-493a-825f-85a9dfbde315" targetNamespace="http://schemas.microsoft.com/office/2006/metadata/properties" ma:root="true" ma:fieldsID="45e32b76c8e436055369618aac27ad35" ns2:_="" ns3:_="">
     <xsd:import namespace="55abea07-cd72-4a95-add0-1082a24cf9e9"/>
@@ -12204,7 +12173,7 @@
 </ct:contentTypeSchema>
 </file>
 
-<file path=customXml/item3.xml><?xml version="1.0" encoding="utf-8"?>
+<file path=customXml/item2.xml><?xml version="1.0" encoding="utf-8"?>
 <?mso-contentType ?>
 <FormTemplates xmlns="http://schemas.microsoft.com/sharepoint/v3/contenttype/forms">
   <Display>DocumentLibraryForm</Display>
@@ -12213,22 +12182,22 @@
 </FormTemplates>
 </file>
 
-<file path=customXml/item4.xml><?xml version="1.0" encoding="utf-8"?>
+<file path=customXml/item3.xml><?xml version="1.0" encoding="utf-8"?>
 <b:Sources xmlns:b="http://schemas.openxmlformats.org/officeDocument/2006/bibliography" xmlns="http://schemas.openxmlformats.org/officeDocument/2006/bibliography" SelectedStyle="\APASixthEditionOfficeOnline.xsl" StyleName="APA" Version="6"/>
 </file>
 
-<file path=customXml/itemProps1.xml><?xml version="1.0" encoding="utf-8"?>
-<ds:datastoreItem xmlns:ds="http://schemas.openxmlformats.org/officeDocument/2006/customXml" ds:itemID="{CEECB56F-E1D8-45BF-A0A3-B5258E7263D4}">
-  <ds:schemaRefs>
-    <ds:schemaRef ds:uri="http://schemas.microsoft.com/office/2006/metadata/properties"/>
-    <ds:schemaRef ds:uri="http://schemas.microsoft.com/office/infopath/2007/PartnerControls"/>
-    <ds:schemaRef ds:uri="285d351f-f218-493a-825f-85a9dfbde315"/>
-    <ds:schemaRef ds:uri="55abea07-cd72-4a95-add0-1082a24cf9e9"/>
-  </ds:schemaRefs>
-</ds:datastoreItem>
+<file path=customXml/item4.xml><?xml version="1.0" encoding="utf-8"?>
+<p:properties xmlns:p="http://schemas.microsoft.com/office/2006/metadata/properties" xmlns:xsi="http://www.w3.org/2001/XMLSchema-instance" xmlns:pc="http://schemas.microsoft.com/office/infopath/2007/PartnerControls">
+  <documentManagement>
+    <TaxCatchAll xmlns="285d351f-f218-493a-825f-85a9dfbde315" xsi:nil="true"/>
+    <lcf76f155ced4ddcb4097134ff3c332f xmlns="55abea07-cd72-4a95-add0-1082a24cf9e9">
+      <Terms xmlns="http://schemas.microsoft.com/office/infopath/2007/PartnerControls"/>
+    </lcf76f155ced4ddcb4097134ff3c332f>
+  </documentManagement>
+</p:properties>
 </file>
 
-<file path=customXml/itemProps2.xml><?xml version="1.0" encoding="utf-8"?>
+<file path=customXml/itemProps1.xml><?xml version="1.0" encoding="utf-8"?>
 <ds:datastoreItem xmlns:ds="http://schemas.openxmlformats.org/officeDocument/2006/customXml" ds:itemID="{90C2CD9F-4C19-4BD0-8741-FFAE32082EC3}">
   <ds:schemaRefs>
     <ds:schemaRef ds:uri="http://schemas.microsoft.com/office/2006/metadata/contentType"/>
@@ -12247,7 +12216,7 @@
 </ds:datastoreItem>
 </file>
 
-<file path=customXml/itemProps3.xml><?xml version="1.0" encoding="utf-8"?>
+<file path=customXml/itemProps2.xml><?xml version="1.0" encoding="utf-8"?>
 <ds:datastoreItem xmlns:ds="http://schemas.openxmlformats.org/officeDocument/2006/customXml" ds:itemID="{91756AAB-0645-4FFC-990B-34BB6096B23B}">
   <ds:schemaRefs>
     <ds:schemaRef ds:uri="http://schemas.microsoft.com/sharepoint/v3/contenttype/forms"/>
@@ -12255,10 +12224,21 @@
 </ds:datastoreItem>
 </file>
 
-<file path=customXml/itemProps4.xml><?xml version="1.0" encoding="utf-8"?>
+<file path=customXml/itemProps3.xml><?xml version="1.0" encoding="utf-8"?>
 <ds:datastoreItem xmlns:ds="http://schemas.openxmlformats.org/officeDocument/2006/customXml" ds:itemID="{278AF5E2-B50F-4A75-A72C-91617034AC7A}">
   <ds:schemaRefs>
     <ds:schemaRef ds:uri="http://schemas.openxmlformats.org/officeDocument/2006/bibliography"/>
   </ds:schemaRefs>
 </ds:datastoreItem>
+</file>
+
+<file path=customXml/itemProps4.xml><?xml version="1.0" encoding="utf-8"?>
+<ds:datastoreItem xmlns:ds="http://schemas.openxmlformats.org/officeDocument/2006/customXml" ds:itemID="{CEECB56F-E1D8-45BF-A0A3-B5258E7263D4}">
+  <ds:schemaRefs>
+    <ds:schemaRef ds:uri="http://schemas.microsoft.com/office/2006/metadata/properties"/>
+    <ds:schemaRef ds:uri="http://schemas.microsoft.com/office/infopath/2007/PartnerControls"/>
+    <ds:schemaRef ds:uri="285d351f-f218-493a-825f-85a9dfbde315"/>
+    <ds:schemaRef ds:uri="55abea07-cd72-4a95-add0-1082a24cf9e9"/>
+  </ds:schemaRefs>
+</ds:datastoreItem>
 </file>
</xml_diff>